<commit_message>
links and wording updated
</commit_message>
<xml_diff>
--- a/project_documents/code_submission_check_in.docx
+++ b/project_documents/code_submission_check_in.docx
@@ -4,28 +4,28 @@
   <w:body>
     <w:p>
       <w:pPr>
+        <w:pStyle w:val="Heading1"/>
+        <w:rPr>
+          <w:rFonts w:ascii="Times New Roman" w:eastAsia="Times New Roman" w:hAnsi="Times New Roman" w:cs="Times New Roman"/>
+        </w:rPr>
+      </w:pPr>
+      <w:r>
+        <w:rPr>
+          <w:rFonts w:ascii="Times New Roman" w:eastAsia="Times New Roman" w:hAnsi="Times New Roman" w:cs="Times New Roman"/>
+        </w:rPr>
+        <w:t>Sentiment Intelligence for Mountain Bike Product Reviews: A Comparative NLP Case Study</w:t>
+      </w:r>
+    </w:p>
+    <w:p>
+      <w:pPr>
         <w:pStyle w:val="Heading2"/>
         <w:rPr>
-          <w:rFonts w:eastAsia="Times New Roman"/>
-        </w:rPr>
-      </w:pPr>
-      <w:r>
-        <w:rPr>
-          <w:rFonts w:eastAsia="Times New Roman"/>
-        </w:rPr>
-        <w:t>Sentiment Intelligence for Mountain Bike Product Reviews: A Comparative NLP Case Study</w:t>
-      </w:r>
-    </w:p>
-    <w:p>
-      <w:pPr>
-        <w:pStyle w:val="Heading3"/>
-        <w:rPr>
-          <w:rFonts w:eastAsia="Times New Roman"/>
-        </w:rPr>
-      </w:pPr>
-      <w:r>
-        <w:rPr>
-          <w:rFonts w:eastAsia="Times New Roman"/>
+          <w:rFonts w:ascii="Times New Roman" w:eastAsia="Times New Roman" w:hAnsi="Times New Roman" w:cs="Times New Roman"/>
+        </w:rPr>
+      </w:pPr>
+      <w:r>
+        <w:rPr>
+          <w:rFonts w:ascii="Times New Roman" w:eastAsia="Times New Roman" w:hAnsi="Times New Roman" w:cs="Times New Roman"/>
         </w:rPr>
         <w:t>Project Overview</w:t>
       </w:r>
@@ -45,23 +45,7 @@
           <w:kern w:val="0"/>
           <w14:ligatures w14:val="none"/>
         </w:rPr>
-        <w:t xml:space="preserve">This submission contains the Python code supporting the data collection, cleaning, and preprocessing stages of my DS785 capstone project. The objective of the project is to collect professional mountain bike product reviews from Pinkbike, transform the unstructured web content into a structured dataset, and prepare the data for subsequent </w:t>
-      </w:r>
-      <w:r>
-        <w:rPr>
-          <w:rFonts w:ascii="Times New Roman" w:eastAsia="Times New Roman" w:hAnsi="Times New Roman" w:cs="Times New Roman"/>
-          <w:kern w:val="0"/>
-          <w14:ligatures w14:val="none"/>
-        </w:rPr>
-        <w:t xml:space="preserve">NLP </w:t>
-      </w:r>
-      <w:r>
-        <w:rPr>
-          <w:rFonts w:ascii="Times New Roman" w:eastAsia="Times New Roman" w:hAnsi="Times New Roman" w:cs="Times New Roman"/>
-          <w:kern w:val="0"/>
-          <w14:ligatures w14:val="none"/>
-        </w:rPr>
-        <w:t>and sentiment analysis.</w:t>
+        <w:t>This submission contains the Python code supporting the data collection, cleaning, and preprocessing stages of my DS785 capstone project. The objective of the project is to collect professional mountain bike product reviews from Pinkbike, transform the unstructured web content into a structured dataset, and prepare the data for subsequent NLP and sentiment analysis.</w:t>
       </w:r>
     </w:p>
     <w:p>
@@ -84,1378 +68,14 @@
     </w:p>
     <w:p>
       <w:pPr>
-        <w:pStyle w:val="Heading3"/>
-        <w:rPr>
-          <w:rFonts w:eastAsia="Times New Roman"/>
-        </w:rPr>
-      </w:pPr>
-      <w:r>
-        <w:rPr>
-          <w:rFonts w:eastAsia="Times New Roman"/>
-        </w:rPr>
-        <w:t>Code Organization</w:t>
-      </w:r>
-    </w:p>
-    <w:p>
-      <w:pPr>
-        <w:spacing w:before="100" w:beforeAutospacing="1" w:after="100" w:afterAutospacing="1" w:line="240" w:lineRule="auto"/>
-        <w:rPr>
-          <w:rFonts w:ascii="Times New Roman" w:eastAsia="Times New Roman" w:hAnsi="Times New Roman" w:cs="Times New Roman"/>
-          <w:kern w:val="0"/>
-          <w14:ligatures w14:val="none"/>
-        </w:rPr>
-      </w:pPr>
-      <w:r>
-        <w:rPr>
-          <w:rFonts w:ascii="Times New Roman" w:eastAsia="Times New Roman" w:hAnsi="Times New Roman" w:cs="Times New Roman"/>
-          <w:kern w:val="0"/>
-          <w14:ligatures w14:val="none"/>
-        </w:rPr>
-        <w:t>The project is organized into the following primary Python modules.</w:t>
-      </w:r>
-    </w:p>
-    <w:p>
-      <w:pPr>
-        <w:pStyle w:val="Heading4"/>
-        <w:rPr>
-          <w:rFonts w:eastAsia="Times New Roman"/>
-          <w:i w:val="0"/>
-          <w:iCs w:val="0"/>
-        </w:rPr>
-      </w:pPr>
-      <w:r>
-        <w:rPr>
-          <w:rFonts w:eastAsia="Times New Roman"/>
-          <w:i w:val="0"/>
-          <w:iCs w:val="0"/>
-        </w:rPr>
-        <w:t>config.py</w:t>
-      </w:r>
-    </w:p>
-    <w:p>
-      <w:r>
-        <w:t>link to file</w:t>
-      </w:r>
-    </w:p>
-    <w:p>
-      <w:pPr>
-        <w:numPr>
-          <w:ilvl w:val="0"/>
-          <w:numId w:val="1"/>
-        </w:numPr>
-        <w:spacing w:before="100" w:beforeAutospacing="1" w:after="100" w:afterAutospacing="1" w:line="240" w:lineRule="auto"/>
-        <w:rPr>
-          <w:rFonts w:ascii="Times New Roman" w:eastAsia="Times New Roman" w:hAnsi="Times New Roman" w:cs="Times New Roman"/>
-          <w:kern w:val="0"/>
-          <w14:ligatures w14:val="none"/>
-        </w:rPr>
-      </w:pPr>
-      <w:r>
-        <w:rPr>
-          <w:rFonts w:ascii="Times New Roman" w:eastAsia="Times New Roman" w:hAnsi="Times New Roman" w:cs="Times New Roman"/>
-          <w:kern w:val="0"/>
-          <w14:ligatures w14:val="none"/>
-        </w:rPr>
-        <w:t>Project directory structure</w:t>
-      </w:r>
-    </w:p>
-    <w:p>
-      <w:pPr>
-        <w:numPr>
-          <w:ilvl w:val="0"/>
-          <w:numId w:val="1"/>
-        </w:numPr>
-        <w:spacing w:before="100" w:beforeAutospacing="1" w:after="100" w:afterAutospacing="1" w:line="240" w:lineRule="auto"/>
-        <w:rPr>
-          <w:rFonts w:ascii="Times New Roman" w:eastAsia="Times New Roman" w:hAnsi="Times New Roman" w:cs="Times New Roman"/>
-          <w:kern w:val="0"/>
-          <w14:ligatures w14:val="none"/>
-        </w:rPr>
-      </w:pPr>
-      <w:r>
-        <w:rPr>
-          <w:rFonts w:ascii="Times New Roman" w:eastAsia="Times New Roman" w:hAnsi="Times New Roman" w:cs="Times New Roman"/>
-          <w:kern w:val="0"/>
-          <w14:ligatures w14:val="none"/>
-        </w:rPr>
-        <w:t>Input and output file locations</w:t>
-      </w:r>
-    </w:p>
-    <w:p>
-      <w:pPr>
-        <w:numPr>
-          <w:ilvl w:val="0"/>
-          <w:numId w:val="1"/>
-        </w:numPr>
-        <w:spacing w:before="100" w:beforeAutospacing="1" w:after="100" w:afterAutospacing="1" w:line="240" w:lineRule="auto"/>
-        <w:rPr>
-          <w:rFonts w:ascii="Times New Roman" w:eastAsia="Times New Roman" w:hAnsi="Times New Roman" w:cs="Times New Roman"/>
-          <w:kern w:val="0"/>
-          <w14:ligatures w14:val="none"/>
-        </w:rPr>
-      </w:pPr>
-      <w:r>
-        <w:rPr>
-          <w:rFonts w:ascii="Times New Roman" w:eastAsia="Times New Roman" w:hAnsi="Times New Roman" w:cs="Times New Roman"/>
-          <w:kern w:val="0"/>
-          <w14:ligatures w14:val="none"/>
-        </w:rPr>
-        <w:t>Browser and scraper settings</w:t>
-      </w:r>
-    </w:p>
-    <w:p>
-      <w:pPr>
-        <w:numPr>
-          <w:ilvl w:val="0"/>
-          <w:numId w:val="1"/>
-        </w:numPr>
-        <w:spacing w:before="100" w:beforeAutospacing="1" w:after="100" w:afterAutospacing="1" w:line="240" w:lineRule="auto"/>
-        <w:rPr>
-          <w:rFonts w:ascii="Times New Roman" w:eastAsia="Times New Roman" w:hAnsi="Times New Roman" w:cs="Times New Roman"/>
-          <w:kern w:val="0"/>
-          <w14:ligatures w14:val="none"/>
-        </w:rPr>
-      </w:pPr>
-      <w:r>
-        <w:rPr>
-          <w:rFonts w:ascii="Times New Roman" w:eastAsia="Times New Roman" w:hAnsi="Times New Roman" w:cs="Times New Roman"/>
-          <w:kern w:val="0"/>
-          <w14:ligatures w14:val="none"/>
-        </w:rPr>
-        <w:t>Shared project constants</w:t>
-      </w:r>
-    </w:p>
-    <w:p>
-      <w:pPr>
-        <w:spacing w:before="100" w:beforeAutospacing="1" w:after="100" w:afterAutospacing="1" w:line="240" w:lineRule="auto"/>
-        <w:rPr>
-          <w:rFonts w:ascii="Times New Roman" w:eastAsia="Times New Roman" w:hAnsi="Times New Roman" w:cs="Times New Roman"/>
-          <w:kern w:val="0"/>
-          <w14:ligatures w14:val="none"/>
-        </w:rPr>
-      </w:pPr>
-      <w:r>
-        <w:rPr>
-          <w:rFonts w:ascii="Times New Roman" w:eastAsia="Times New Roman" w:hAnsi="Times New Roman" w:cs="Times New Roman"/>
-          <w:kern w:val="0"/>
-          <w14:ligatures w14:val="none"/>
-        </w:rPr>
-        <w:t>Using a centralized configuration file allows changes to be made in one location rather than throughout multiple scripts.</w:t>
-      </w:r>
-    </w:p>
-    <w:p>
-      <w:pPr>
-        <w:pStyle w:val="Heading4"/>
-        <w:rPr>
-          <w:rFonts w:eastAsia="Times New Roman"/>
-          <w:i w:val="0"/>
-          <w:iCs w:val="0"/>
-        </w:rPr>
-      </w:pPr>
-      <w:r>
-        <w:rPr>
-          <w:rFonts w:eastAsia="Times New Roman"/>
-          <w:i w:val="0"/>
-          <w:iCs w:val="0"/>
-        </w:rPr>
-        <w:t>utils.py</w:t>
-      </w:r>
-    </w:p>
-    <w:p>
-      <w:r>
-        <w:t>link to file</w:t>
-      </w:r>
-    </w:p>
-    <w:p>
-      <w:pPr>
-        <w:spacing w:before="100" w:beforeAutospacing="1" w:after="100" w:afterAutospacing="1" w:line="240" w:lineRule="auto"/>
-        <w:rPr>
-          <w:rFonts w:ascii="Times New Roman" w:eastAsia="Times New Roman" w:hAnsi="Times New Roman" w:cs="Times New Roman"/>
-          <w:kern w:val="0"/>
-          <w14:ligatures w14:val="none"/>
-        </w:rPr>
-      </w:pPr>
-      <w:r>
-        <w:rPr>
-          <w:rFonts w:ascii="Times New Roman" w:eastAsia="Times New Roman" w:hAnsi="Times New Roman" w:cs="Times New Roman"/>
-          <w:kern w:val="0"/>
-          <w14:ligatures w14:val="none"/>
-        </w:rPr>
-        <w:t>Contains reusable helper functions used across the project</w:t>
-      </w:r>
-      <w:r>
-        <w:rPr>
-          <w:rFonts w:ascii="Times New Roman" w:eastAsia="Times New Roman" w:hAnsi="Times New Roman" w:cs="Times New Roman"/>
-          <w:kern w:val="0"/>
-          <w14:ligatures w14:val="none"/>
-        </w:rPr>
-        <w:t xml:space="preserve"> for the following:</w:t>
-      </w:r>
-    </w:p>
-    <w:p>
-      <w:pPr>
-        <w:numPr>
-          <w:ilvl w:val="0"/>
-          <w:numId w:val="2"/>
-        </w:numPr>
-        <w:spacing w:before="100" w:beforeAutospacing="1" w:after="100" w:afterAutospacing="1" w:line="240" w:lineRule="auto"/>
-        <w:rPr>
-          <w:rFonts w:ascii="Times New Roman" w:eastAsia="Times New Roman" w:hAnsi="Times New Roman" w:cs="Times New Roman"/>
-          <w:kern w:val="0"/>
-          <w14:ligatures w14:val="none"/>
-        </w:rPr>
-      </w:pPr>
-      <w:r>
-        <w:rPr>
-          <w:rFonts w:ascii="Times New Roman" w:eastAsia="Times New Roman" w:hAnsi="Times New Roman" w:cs="Times New Roman"/>
-          <w:kern w:val="0"/>
-          <w14:ligatures w14:val="none"/>
-        </w:rPr>
-        <w:t>URL normalization for duplicate detection</w:t>
-      </w:r>
-    </w:p>
-    <w:p>
-      <w:pPr>
-        <w:numPr>
-          <w:ilvl w:val="0"/>
-          <w:numId w:val="2"/>
-        </w:numPr>
-        <w:spacing w:before="100" w:beforeAutospacing="1" w:after="100" w:afterAutospacing="1" w:line="240" w:lineRule="auto"/>
-        <w:rPr>
-          <w:rFonts w:ascii="Times New Roman" w:eastAsia="Times New Roman" w:hAnsi="Times New Roman" w:cs="Times New Roman"/>
-          <w:kern w:val="0"/>
-          <w14:ligatures w14:val="none"/>
-        </w:rPr>
-      </w:pPr>
-      <w:r>
-        <w:rPr>
-          <w:rFonts w:ascii="Times New Roman" w:eastAsia="Times New Roman" w:hAnsi="Times New Roman" w:cs="Times New Roman"/>
-          <w:kern w:val="0"/>
-          <w14:ligatures w14:val="none"/>
-        </w:rPr>
-        <w:t>Safe HTML filename generation</w:t>
-      </w:r>
-    </w:p>
-    <w:p>
-      <w:pPr>
-        <w:spacing w:before="100" w:beforeAutospacing="1" w:after="100" w:afterAutospacing="1" w:line="240" w:lineRule="auto"/>
-        <w:rPr>
-          <w:rFonts w:ascii="Times New Roman" w:eastAsia="Times New Roman" w:hAnsi="Times New Roman" w:cs="Times New Roman"/>
-          <w:kern w:val="0"/>
-          <w14:ligatures w14:val="none"/>
-        </w:rPr>
-      </w:pPr>
-      <w:r>
-        <w:rPr>
-          <w:rFonts w:ascii="Times New Roman" w:eastAsia="Times New Roman" w:hAnsi="Times New Roman" w:cs="Times New Roman"/>
-          <w:kern w:val="0"/>
-          <w14:ligatures w14:val="none"/>
-        </w:rPr>
-        <w:t>These shared utilities reduce duplicated code and improve consistency throughout the pipeline.</w:t>
-      </w:r>
-    </w:p>
-    <w:p>
-      <w:pPr>
-        <w:pStyle w:val="Heading4"/>
-        <w:rPr>
-          <w:rFonts w:eastAsia="Times New Roman"/>
-          <w:i w:val="0"/>
-          <w:iCs w:val="0"/>
-        </w:rPr>
-      </w:pPr>
-      <w:r>
-        <w:rPr>
-          <w:rFonts w:eastAsia="Times New Roman"/>
-          <w:i w:val="0"/>
-          <w:iCs w:val="0"/>
-        </w:rPr>
-        <w:t>discover_links.py</w:t>
-      </w:r>
-    </w:p>
-    <w:p>
-      <w:r>
-        <w:t>link to file</w:t>
-      </w:r>
-    </w:p>
-    <w:p>
-      <w:pPr>
-        <w:spacing w:before="100" w:beforeAutospacing="1" w:after="100" w:afterAutospacing="1" w:line="240" w:lineRule="auto"/>
-        <w:rPr>
-          <w:rFonts w:ascii="Times New Roman" w:eastAsia="Times New Roman" w:hAnsi="Times New Roman" w:cs="Times New Roman"/>
-          <w:kern w:val="0"/>
-          <w14:ligatures w14:val="none"/>
-        </w:rPr>
-      </w:pPr>
-      <w:r>
-        <w:rPr>
-          <w:rFonts w:ascii="Times New Roman" w:eastAsia="Times New Roman" w:hAnsi="Times New Roman" w:cs="Times New Roman"/>
-          <w:kern w:val="0"/>
-          <w14:ligatures w14:val="none"/>
-        </w:rPr>
-        <w:lastRenderedPageBreak/>
-        <w:t>Supports the data collection stage by:</w:t>
-      </w:r>
-    </w:p>
-    <w:p>
-      <w:pPr>
-        <w:numPr>
-          <w:ilvl w:val="0"/>
-          <w:numId w:val="3"/>
-        </w:numPr>
-        <w:spacing w:before="100" w:beforeAutospacing="1" w:after="100" w:afterAutospacing="1" w:line="240" w:lineRule="auto"/>
-        <w:rPr>
-          <w:rFonts w:ascii="Times New Roman" w:eastAsia="Times New Roman" w:hAnsi="Times New Roman" w:cs="Times New Roman"/>
-          <w:kern w:val="0"/>
-          <w14:ligatures w14:val="none"/>
-        </w:rPr>
-      </w:pPr>
-      <w:r>
-        <w:rPr>
-          <w:rFonts w:ascii="Times New Roman" w:eastAsia="Times New Roman" w:hAnsi="Times New Roman" w:cs="Times New Roman"/>
-          <w:kern w:val="0"/>
-          <w14:ligatures w14:val="none"/>
-        </w:rPr>
-        <w:t>Visiting the Pinkbike Reviews page</w:t>
-      </w:r>
-    </w:p>
-    <w:p>
-      <w:pPr>
-        <w:numPr>
-          <w:ilvl w:val="0"/>
-          <w:numId w:val="3"/>
-        </w:numPr>
-        <w:spacing w:before="100" w:beforeAutospacing="1" w:after="100" w:afterAutospacing="1" w:line="240" w:lineRule="auto"/>
-        <w:rPr>
-          <w:rFonts w:ascii="Times New Roman" w:eastAsia="Times New Roman" w:hAnsi="Times New Roman" w:cs="Times New Roman"/>
-          <w:kern w:val="0"/>
-          <w14:ligatures w14:val="none"/>
-        </w:rPr>
-      </w:pPr>
-      <w:r>
-        <w:rPr>
-          <w:rFonts w:ascii="Times New Roman" w:eastAsia="Times New Roman" w:hAnsi="Times New Roman" w:cs="Times New Roman"/>
-          <w:kern w:val="0"/>
-          <w14:ligatures w14:val="none"/>
-        </w:rPr>
-        <w:t>Automatically scrolling to load available review articles</w:t>
-      </w:r>
-    </w:p>
-    <w:p>
-      <w:pPr>
-        <w:numPr>
-          <w:ilvl w:val="0"/>
-          <w:numId w:val="3"/>
-        </w:numPr>
-        <w:spacing w:before="100" w:beforeAutospacing="1" w:after="100" w:afterAutospacing="1" w:line="240" w:lineRule="auto"/>
-        <w:rPr>
-          <w:rFonts w:ascii="Times New Roman" w:eastAsia="Times New Roman" w:hAnsi="Times New Roman" w:cs="Times New Roman"/>
-          <w:kern w:val="0"/>
-          <w14:ligatures w14:val="none"/>
-        </w:rPr>
-      </w:pPr>
-      <w:r>
-        <w:rPr>
-          <w:rFonts w:ascii="Times New Roman" w:eastAsia="Times New Roman" w:hAnsi="Times New Roman" w:cs="Times New Roman"/>
-          <w:kern w:val="0"/>
-          <w14:ligatures w14:val="none"/>
-        </w:rPr>
-        <w:t>Extracting candidate review URLs</w:t>
-      </w:r>
-    </w:p>
-    <w:p>
-      <w:pPr>
-        <w:numPr>
-          <w:ilvl w:val="0"/>
-          <w:numId w:val="3"/>
-        </w:numPr>
-        <w:spacing w:before="100" w:beforeAutospacing="1" w:after="100" w:afterAutospacing="1" w:line="240" w:lineRule="auto"/>
-        <w:rPr>
-          <w:rFonts w:ascii="Times New Roman" w:eastAsia="Times New Roman" w:hAnsi="Times New Roman" w:cs="Times New Roman"/>
-          <w:kern w:val="0"/>
-          <w14:ligatures w14:val="none"/>
-        </w:rPr>
-      </w:pPr>
-      <w:r>
-        <w:rPr>
-          <w:rFonts w:ascii="Times New Roman" w:eastAsia="Times New Roman" w:hAnsi="Times New Roman" w:cs="Times New Roman"/>
-          <w:kern w:val="0"/>
-          <w14:ligatures w14:val="none"/>
-        </w:rPr>
-        <w:t>Removing duplicate URLs</w:t>
-      </w:r>
-    </w:p>
-    <w:p>
-      <w:pPr>
-        <w:numPr>
-          <w:ilvl w:val="0"/>
-          <w:numId w:val="3"/>
-        </w:numPr>
-        <w:spacing w:before="100" w:beforeAutospacing="1" w:after="100" w:afterAutospacing="1" w:line="240" w:lineRule="auto"/>
-        <w:rPr>
-          <w:rFonts w:ascii="Times New Roman" w:eastAsia="Times New Roman" w:hAnsi="Times New Roman" w:cs="Times New Roman"/>
-          <w:kern w:val="0"/>
-          <w14:ligatures w14:val="none"/>
-        </w:rPr>
-      </w:pPr>
-      <w:r>
-        <w:rPr>
-          <w:rFonts w:ascii="Times New Roman" w:eastAsia="Times New Roman" w:hAnsi="Times New Roman" w:cs="Times New Roman"/>
-          <w:kern w:val="0"/>
-          <w14:ligatures w14:val="none"/>
-        </w:rPr>
-        <w:t xml:space="preserve">Updating the master </w:t>
-      </w:r>
-      <w:r>
-        <w:rPr>
-          <w:rFonts w:ascii="Times New Roman" w:eastAsia="Times New Roman" w:hAnsi="Times New Roman" w:cs="Times New Roman"/>
-          <w:kern w:val="0"/>
-          <w:sz w:val="20"/>
-          <w:szCs w:val="20"/>
-          <w14:ligatures w14:val="none"/>
-        </w:rPr>
-        <w:t>review_links.csv</w:t>
-      </w:r>
-      <w:r>
-        <w:rPr>
-          <w:rFonts w:ascii="Times New Roman" w:eastAsia="Times New Roman" w:hAnsi="Times New Roman" w:cs="Times New Roman"/>
-          <w:kern w:val="0"/>
-          <w14:ligatures w14:val="none"/>
-        </w:rPr>
-        <w:t xml:space="preserve"> reference dataset</w:t>
-      </w:r>
-    </w:p>
-    <w:p>
-      <w:pPr>
-        <w:spacing w:before="100" w:beforeAutospacing="1" w:after="100" w:afterAutospacing="1" w:line="240" w:lineRule="auto"/>
-        <w:rPr>
-          <w:rFonts w:ascii="Times New Roman" w:eastAsia="Times New Roman" w:hAnsi="Times New Roman" w:cs="Times New Roman"/>
-          <w:kern w:val="0"/>
-          <w14:ligatures w14:val="none"/>
-        </w:rPr>
-      </w:pPr>
-      <w:r>
-        <w:rPr>
-          <w:rFonts w:ascii="Times New Roman" w:eastAsia="Times New Roman" w:hAnsi="Times New Roman" w:cs="Times New Roman"/>
-          <w:kern w:val="0"/>
-          <w14:ligatures w14:val="none"/>
-        </w:rPr>
-        <w:t>This script is only responsible for maintaining the master list of review articles.</w:t>
-      </w:r>
-    </w:p>
-    <w:p>
-      <w:pPr>
-        <w:pStyle w:val="Heading4"/>
-        <w:rPr>
-          <w:rFonts w:eastAsia="Times New Roman"/>
-          <w:i w:val="0"/>
-          <w:iCs w:val="0"/>
-        </w:rPr>
-      </w:pPr>
-      <w:r>
-        <w:rPr>
-          <w:rFonts w:eastAsia="Times New Roman"/>
-          <w:i w:val="0"/>
-          <w:iCs w:val="0"/>
-        </w:rPr>
-        <w:t>scrape_articles.py</w:t>
-      </w:r>
-    </w:p>
-    <w:p>
-      <w:r>
-        <w:t>link to file</w:t>
-      </w:r>
-    </w:p>
-    <w:p>
-      <w:pPr>
-        <w:spacing w:before="100" w:beforeAutospacing="1" w:after="100" w:afterAutospacing="1" w:line="240" w:lineRule="auto"/>
-        <w:rPr>
-          <w:rFonts w:ascii="Times New Roman" w:eastAsia="Times New Roman" w:hAnsi="Times New Roman" w:cs="Times New Roman"/>
-          <w:kern w:val="0"/>
-          <w14:ligatures w14:val="none"/>
-        </w:rPr>
-      </w:pPr>
-      <w:r>
-        <w:rPr>
-          <w:rFonts w:ascii="Times New Roman" w:eastAsia="Times New Roman" w:hAnsi="Times New Roman" w:cs="Times New Roman"/>
-          <w:kern w:val="0"/>
-          <w14:ligatures w14:val="none"/>
-        </w:rPr>
-        <w:t>Supports the data collection stage by:</w:t>
-      </w:r>
-    </w:p>
-    <w:p>
-      <w:pPr>
-        <w:numPr>
-          <w:ilvl w:val="0"/>
-          <w:numId w:val="4"/>
-        </w:numPr>
-        <w:spacing w:before="100" w:beforeAutospacing="1" w:after="100" w:afterAutospacing="1" w:line="240" w:lineRule="auto"/>
-        <w:rPr>
-          <w:rFonts w:ascii="Times New Roman" w:eastAsia="Times New Roman" w:hAnsi="Times New Roman" w:cs="Times New Roman"/>
-          <w:kern w:val="0"/>
-          <w14:ligatures w14:val="none"/>
-        </w:rPr>
-      </w:pPr>
-      <w:r>
-        <w:rPr>
-          <w:rFonts w:ascii="Times New Roman" w:eastAsia="Times New Roman" w:hAnsi="Times New Roman" w:cs="Times New Roman"/>
-          <w:kern w:val="0"/>
-          <w14:ligatures w14:val="none"/>
-        </w:rPr>
-        <w:t>Reading the master review URL list</w:t>
-      </w:r>
-    </w:p>
-    <w:p>
-      <w:pPr>
-        <w:numPr>
-          <w:ilvl w:val="0"/>
-          <w:numId w:val="4"/>
-        </w:numPr>
-        <w:spacing w:before="100" w:beforeAutospacing="1" w:after="100" w:afterAutospacing="1" w:line="240" w:lineRule="auto"/>
-        <w:rPr>
-          <w:rFonts w:ascii="Times New Roman" w:eastAsia="Times New Roman" w:hAnsi="Times New Roman" w:cs="Times New Roman"/>
-          <w:kern w:val="0"/>
-          <w14:ligatures w14:val="none"/>
-        </w:rPr>
-      </w:pPr>
-      <w:r>
-        <w:rPr>
-          <w:rFonts w:ascii="Times New Roman" w:eastAsia="Times New Roman" w:hAnsi="Times New Roman" w:cs="Times New Roman"/>
-          <w:kern w:val="0"/>
-          <w14:ligatures w14:val="none"/>
-        </w:rPr>
-        <w:t>Identifying the next article that has not already been downloaded</w:t>
-      </w:r>
-    </w:p>
-    <w:p>
-      <w:pPr>
-        <w:numPr>
-          <w:ilvl w:val="0"/>
-          <w:numId w:val="4"/>
-        </w:numPr>
-        <w:spacing w:before="100" w:beforeAutospacing="1" w:after="100" w:afterAutospacing="1" w:line="240" w:lineRule="auto"/>
-        <w:rPr>
-          <w:rFonts w:ascii="Times New Roman" w:eastAsia="Times New Roman" w:hAnsi="Times New Roman" w:cs="Times New Roman"/>
-          <w:kern w:val="0"/>
-          <w14:ligatures w14:val="none"/>
-        </w:rPr>
-      </w:pPr>
-      <w:r>
-        <w:rPr>
-          <w:rFonts w:ascii="Times New Roman" w:eastAsia="Times New Roman" w:hAnsi="Times New Roman" w:cs="Times New Roman"/>
-          <w:kern w:val="0"/>
-          <w14:ligatures w14:val="none"/>
-        </w:rPr>
-        <w:t>Downloading one article HTML page using Playwright</w:t>
-      </w:r>
-    </w:p>
-    <w:p>
-      <w:pPr>
-        <w:numPr>
-          <w:ilvl w:val="0"/>
-          <w:numId w:val="4"/>
-        </w:numPr>
-        <w:spacing w:before="100" w:beforeAutospacing="1" w:after="100" w:afterAutospacing="1" w:line="240" w:lineRule="auto"/>
-        <w:rPr>
-          <w:rFonts w:ascii="Times New Roman" w:eastAsia="Times New Roman" w:hAnsi="Times New Roman" w:cs="Times New Roman"/>
-          <w:kern w:val="0"/>
-          <w14:ligatures w14:val="none"/>
-        </w:rPr>
-      </w:pPr>
-      <w:r>
-        <w:rPr>
-          <w:rFonts w:ascii="Times New Roman" w:eastAsia="Times New Roman" w:hAnsi="Times New Roman" w:cs="Times New Roman"/>
-          <w:kern w:val="0"/>
-          <w14:ligatures w14:val="none"/>
-        </w:rPr>
-        <w:t>Saving the raw HTML locally</w:t>
-      </w:r>
-    </w:p>
-    <w:p>
-      <w:pPr>
-        <w:spacing w:before="100" w:beforeAutospacing="1" w:after="100" w:afterAutospacing="1" w:line="240" w:lineRule="auto"/>
-        <w:rPr>
-          <w:rFonts w:ascii="Times New Roman" w:eastAsia="Times New Roman" w:hAnsi="Times New Roman" w:cs="Times New Roman"/>
-          <w:kern w:val="0"/>
-          <w14:ligatures w14:val="none"/>
-        </w:rPr>
-      </w:pPr>
-      <w:r>
-        <w:rPr>
-          <w:rFonts w:ascii="Times New Roman" w:eastAsia="Times New Roman" w:hAnsi="Times New Roman" w:cs="Times New Roman"/>
-          <w:kern w:val="0"/>
-          <w14:ligatures w14:val="none"/>
-        </w:rPr>
-        <w:t xml:space="preserve">The scraper intentionally downloads </w:t>
-      </w:r>
-      <w:r>
-        <w:rPr>
-          <w:rFonts w:ascii="Times New Roman" w:eastAsia="Times New Roman" w:hAnsi="Times New Roman" w:cs="Times New Roman"/>
-          <w:b/>
-          <w:bCs/>
-          <w:kern w:val="0"/>
-          <w14:ligatures w14:val="none"/>
-        </w:rPr>
-        <w:t>one article per execution</w:t>
-      </w:r>
-      <w:r>
-        <w:rPr>
-          <w:rFonts w:ascii="Times New Roman" w:eastAsia="Times New Roman" w:hAnsi="Times New Roman" w:cs="Times New Roman"/>
-          <w:kern w:val="0"/>
-          <w14:ligatures w14:val="none"/>
-        </w:rPr>
-        <w:t>. This conservative approach reduces repeated requests to the website, simplifies recovery from failures, and improves the reliability of the collection process.</w:t>
-      </w:r>
-    </w:p>
-    <w:p>
-      <w:pPr>
-        <w:pStyle w:val="Heading4"/>
-        <w:rPr>
-          <w:rFonts w:eastAsia="Times New Roman"/>
-          <w:i w:val="0"/>
-          <w:iCs w:val="0"/>
-        </w:rPr>
-      </w:pPr>
-      <w:r>
-        <w:rPr>
-          <w:rFonts w:eastAsia="Times New Roman"/>
-          <w:i w:val="0"/>
-          <w:iCs w:val="0"/>
-        </w:rPr>
-        <w:t>parse_articles.py</w:t>
-      </w:r>
-    </w:p>
-    <w:p>
-      <w:r>
-        <w:t>link to file</w:t>
-      </w:r>
-    </w:p>
-    <w:p>
-      <w:pPr>
-        <w:spacing w:before="100" w:beforeAutospacing="1" w:after="100" w:afterAutospacing="1" w:line="240" w:lineRule="auto"/>
-        <w:rPr>
-          <w:rFonts w:ascii="Times New Roman" w:eastAsia="Times New Roman" w:hAnsi="Times New Roman" w:cs="Times New Roman"/>
-          <w:kern w:val="0"/>
-          <w14:ligatures w14:val="none"/>
-        </w:rPr>
-      </w:pPr>
-      <w:r>
-        <w:rPr>
-          <w:rFonts w:ascii="Times New Roman" w:eastAsia="Times New Roman" w:hAnsi="Times New Roman" w:cs="Times New Roman"/>
-          <w:kern w:val="0"/>
-          <w14:ligatures w14:val="none"/>
-        </w:rPr>
-        <w:t>Supports the cleaning and preprocessing stage by:</w:t>
-      </w:r>
-    </w:p>
-    <w:p>
-      <w:pPr>
-        <w:numPr>
-          <w:ilvl w:val="0"/>
-          <w:numId w:val="5"/>
-        </w:numPr>
-        <w:spacing w:before="100" w:beforeAutospacing="1" w:after="100" w:afterAutospacing="1" w:line="240" w:lineRule="auto"/>
-        <w:rPr>
-          <w:rFonts w:ascii="Times New Roman" w:eastAsia="Times New Roman" w:hAnsi="Times New Roman" w:cs="Times New Roman"/>
-          <w:kern w:val="0"/>
-          <w14:ligatures w14:val="none"/>
-        </w:rPr>
-      </w:pPr>
-      <w:r>
-        <w:rPr>
-          <w:rFonts w:ascii="Times New Roman" w:eastAsia="Times New Roman" w:hAnsi="Times New Roman" w:cs="Times New Roman"/>
-          <w:kern w:val="0"/>
-          <w14:ligatures w14:val="none"/>
-        </w:rPr>
-        <w:t>Reading saved HTML files</w:t>
-      </w:r>
-    </w:p>
-    <w:p>
-      <w:pPr>
-        <w:numPr>
-          <w:ilvl w:val="0"/>
-          <w:numId w:val="5"/>
-        </w:numPr>
-        <w:spacing w:before="100" w:beforeAutospacing="1" w:after="100" w:afterAutospacing="1" w:line="240" w:lineRule="auto"/>
-        <w:rPr>
-          <w:rFonts w:ascii="Times New Roman" w:eastAsia="Times New Roman" w:hAnsi="Times New Roman" w:cs="Times New Roman"/>
-          <w:kern w:val="0"/>
-          <w14:ligatures w14:val="none"/>
-        </w:rPr>
-      </w:pPr>
-      <w:r>
-        <w:rPr>
-          <w:rFonts w:ascii="Times New Roman" w:eastAsia="Times New Roman" w:hAnsi="Times New Roman" w:cs="Times New Roman"/>
-          <w:kern w:val="0"/>
-          <w14:ligatures w14:val="none"/>
-        </w:rPr>
-        <w:t>Extracting article metadata</w:t>
-      </w:r>
-    </w:p>
-    <w:p>
-      <w:pPr>
-        <w:numPr>
-          <w:ilvl w:val="0"/>
-          <w:numId w:val="5"/>
-        </w:numPr>
-        <w:spacing w:before="100" w:beforeAutospacing="1" w:after="100" w:afterAutospacing="1" w:line="240" w:lineRule="auto"/>
-        <w:rPr>
-          <w:rFonts w:ascii="Times New Roman" w:eastAsia="Times New Roman" w:hAnsi="Times New Roman" w:cs="Times New Roman"/>
-          <w:kern w:val="0"/>
-          <w14:ligatures w14:val="none"/>
-        </w:rPr>
-      </w:pPr>
-      <w:r>
-        <w:rPr>
-          <w:rFonts w:ascii="Times New Roman" w:eastAsia="Times New Roman" w:hAnsi="Times New Roman" w:cs="Times New Roman"/>
-          <w:kern w:val="0"/>
-          <w14:ligatures w14:val="none"/>
-        </w:rPr>
-        <w:t>Cleaning article text</w:t>
-      </w:r>
-    </w:p>
-    <w:p>
-      <w:pPr>
-        <w:numPr>
-          <w:ilvl w:val="0"/>
-          <w:numId w:val="5"/>
-        </w:numPr>
-        <w:spacing w:before="100" w:beforeAutospacing="1" w:after="100" w:afterAutospacing="1" w:line="240" w:lineRule="auto"/>
-        <w:rPr>
-          <w:rFonts w:ascii="Times New Roman" w:eastAsia="Times New Roman" w:hAnsi="Times New Roman" w:cs="Times New Roman"/>
-          <w:kern w:val="0"/>
-          <w14:ligatures w14:val="none"/>
-        </w:rPr>
-      </w:pPr>
-      <w:r>
-        <w:rPr>
-          <w:rFonts w:ascii="Times New Roman" w:eastAsia="Times New Roman" w:hAnsi="Times New Roman" w:cs="Times New Roman"/>
-          <w:kern w:val="0"/>
-          <w14:ligatures w14:val="none"/>
-        </w:rPr>
-        <w:t>Extracting retail pricing information</w:t>
-      </w:r>
-    </w:p>
-    <w:p>
-      <w:pPr>
-        <w:numPr>
-          <w:ilvl w:val="0"/>
-          <w:numId w:val="5"/>
-        </w:numPr>
-        <w:spacing w:before="100" w:beforeAutospacing="1" w:after="100" w:afterAutospacing="1" w:line="240" w:lineRule="auto"/>
-        <w:rPr>
-          <w:rFonts w:ascii="Times New Roman" w:eastAsia="Times New Roman" w:hAnsi="Times New Roman" w:cs="Times New Roman"/>
-          <w:kern w:val="0"/>
-          <w14:ligatures w14:val="none"/>
-        </w:rPr>
-      </w:pPr>
-      <w:r>
-        <w:rPr>
-          <w:rFonts w:ascii="Times New Roman" w:eastAsia="Times New Roman" w:hAnsi="Times New Roman" w:cs="Times New Roman"/>
-          <w:kern w:val="0"/>
-          <w14:ligatures w14:val="none"/>
-        </w:rPr>
-        <w:t>Identifying product brands and product names</w:t>
-      </w:r>
-    </w:p>
-    <w:p>
-      <w:pPr>
-        <w:numPr>
-          <w:ilvl w:val="0"/>
-          <w:numId w:val="5"/>
-        </w:numPr>
-        <w:spacing w:before="100" w:beforeAutospacing="1" w:after="100" w:afterAutospacing="1" w:line="240" w:lineRule="auto"/>
-        <w:rPr>
-          <w:rFonts w:ascii="Times New Roman" w:eastAsia="Times New Roman" w:hAnsi="Times New Roman" w:cs="Times New Roman"/>
-          <w:kern w:val="0"/>
-          <w14:ligatures w14:val="none"/>
-        </w:rPr>
-      </w:pPr>
-      <w:r>
-        <w:rPr>
-          <w:rFonts w:ascii="Times New Roman" w:eastAsia="Times New Roman" w:hAnsi="Times New Roman" w:cs="Times New Roman"/>
-          <w:kern w:val="0"/>
-          <w14:ligatures w14:val="none"/>
-        </w:rPr>
-        <w:t>Classifying product category, subcategory, and review type</w:t>
-      </w:r>
-    </w:p>
-    <w:p>
-      <w:pPr>
-        <w:numPr>
-          <w:ilvl w:val="0"/>
-          <w:numId w:val="5"/>
-        </w:numPr>
-        <w:spacing w:before="100" w:beforeAutospacing="1" w:after="100" w:afterAutospacing="1" w:line="240" w:lineRule="auto"/>
-        <w:rPr>
-          <w:rFonts w:ascii="Times New Roman" w:eastAsia="Times New Roman" w:hAnsi="Times New Roman" w:cs="Times New Roman"/>
-          <w:kern w:val="0"/>
-          <w14:ligatures w14:val="none"/>
-        </w:rPr>
-      </w:pPr>
-      <w:r>
-        <w:rPr>
-          <w:rFonts w:ascii="Times New Roman" w:eastAsia="Times New Roman" w:hAnsi="Times New Roman" w:cs="Times New Roman"/>
-          <w:kern w:val="0"/>
-          <w14:ligatures w14:val="none"/>
-        </w:rPr>
-        <w:t>Producing the final structured review-level dataset</w:t>
-      </w:r>
-    </w:p>
-    <w:p>
-      <w:pPr>
-        <w:spacing w:before="100" w:beforeAutospacing="1" w:after="100" w:afterAutospacing="1" w:line="240" w:lineRule="auto"/>
-        <w:rPr>
-          <w:rFonts w:ascii="Times New Roman" w:eastAsia="Times New Roman" w:hAnsi="Times New Roman" w:cs="Times New Roman"/>
-          <w:kern w:val="0"/>
-          <w14:ligatures w14:val="none"/>
-        </w:rPr>
-      </w:pPr>
-      <w:r>
-        <w:rPr>
-          <w:rFonts w:ascii="Times New Roman" w:eastAsia="Times New Roman" w:hAnsi="Times New Roman" w:cs="Times New Roman"/>
-          <w:kern w:val="0"/>
-          <w14:ligatures w14:val="none"/>
-        </w:rPr>
-        <w:t>The resulting dataset will be used during the modeling phase of the project.</w:t>
-      </w:r>
-    </w:p>
-    <w:p>
-      <w:pPr>
-        <w:pStyle w:val="Heading3"/>
-        <w:rPr>
-          <w:rFonts w:eastAsia="Times New Roman"/>
-        </w:rPr>
-      </w:pPr>
-      <w:r>
-        <w:rPr>
-          <w:rFonts w:eastAsia="Times New Roman"/>
-        </w:rPr>
-        <w:t>Project Data Structure</w:t>
-      </w:r>
-    </w:p>
-    <w:p>
-      <w:pPr>
-        <w:spacing w:before="100" w:beforeAutospacing="1" w:after="100" w:afterAutospacing="1" w:line="240" w:lineRule="auto"/>
-        <w:rPr>
-          <w:rFonts w:ascii="Times New Roman" w:eastAsia="Times New Roman" w:hAnsi="Times New Roman" w:cs="Times New Roman"/>
-          <w:kern w:val="0"/>
-          <w14:ligatures w14:val="none"/>
-        </w:rPr>
-      </w:pPr>
-      <w:r>
-        <w:rPr>
-          <w:rFonts w:ascii="Times New Roman" w:eastAsia="Times New Roman" w:hAnsi="Times New Roman" w:cs="Times New Roman"/>
-          <w:kern w:val="0"/>
-          <w14:ligatures w14:val="none"/>
-        </w:rPr>
-        <w:t>The project organizes data into three primary stages.</w:t>
-      </w:r>
-    </w:p>
-    <w:p>
-      <w:pPr>
-        <w:spacing w:before="100" w:beforeAutospacing="1" w:after="100" w:afterAutospacing="1" w:line="240" w:lineRule="auto"/>
-        <w:outlineLvl w:val="2"/>
-        <w:rPr>
-          <w:rFonts w:ascii="Times New Roman" w:eastAsia="Times New Roman" w:hAnsi="Times New Roman" w:cs="Times New Roman"/>
-          <w:kern w:val="0"/>
-          <w:sz w:val="36"/>
-          <w:szCs w:val="36"/>
-          <w14:ligatures w14:val="none"/>
-        </w:rPr>
-      </w:pPr>
-      <w:r>
-        <w:rPr>
-          <w:rFonts w:ascii="Times New Roman" w:eastAsia="Times New Roman" w:hAnsi="Times New Roman" w:cs="Times New Roman"/>
-          <w:kern w:val="0"/>
-          <w14:ligatures w14:val="none"/>
-        </w:rPr>
-        <w:t>data/reference</w:t>
-      </w:r>
-    </w:p>
-    <w:p>
-      <w:pPr>
-        <w:spacing w:before="100" w:beforeAutospacing="1" w:after="100" w:afterAutospacing="1" w:line="240" w:lineRule="auto"/>
-        <w:rPr>
-          <w:rFonts w:ascii="Times New Roman" w:eastAsia="Times New Roman" w:hAnsi="Times New Roman" w:cs="Times New Roman"/>
-          <w:kern w:val="0"/>
-          <w14:ligatures w14:val="none"/>
-        </w:rPr>
-      </w:pPr>
-      <w:r>
-        <w:rPr>
-          <w:rFonts w:ascii="Times New Roman" w:eastAsia="Times New Roman" w:hAnsi="Times New Roman" w:cs="Times New Roman"/>
-          <w:kern w:val="0"/>
-          <w14:ligatures w14:val="none"/>
-        </w:rPr>
-        <w:lastRenderedPageBreak/>
-        <w:t>Reference datasets used during processing, including:</w:t>
-      </w:r>
-    </w:p>
-    <w:p>
-      <w:pPr>
-        <w:numPr>
-          <w:ilvl w:val="0"/>
-          <w:numId w:val="6"/>
-        </w:numPr>
-        <w:spacing w:before="100" w:beforeAutospacing="1" w:after="100" w:afterAutospacing="1" w:line="240" w:lineRule="auto"/>
-        <w:rPr>
-          <w:rFonts w:ascii="Times New Roman" w:eastAsia="Times New Roman" w:hAnsi="Times New Roman" w:cs="Times New Roman"/>
-          <w:kern w:val="0"/>
-          <w14:ligatures w14:val="none"/>
-        </w:rPr>
-      </w:pPr>
-      <w:r>
-        <w:rPr>
-          <w:rFonts w:ascii="Times New Roman" w:eastAsia="Times New Roman" w:hAnsi="Times New Roman" w:cs="Times New Roman"/>
-          <w:kern w:val="0"/>
-          <w14:ligatures w14:val="none"/>
-        </w:rPr>
-        <w:t>Master review URL list</w:t>
-      </w:r>
-    </w:p>
-    <w:p>
-      <w:pPr>
-        <w:numPr>
-          <w:ilvl w:val="0"/>
-          <w:numId w:val="6"/>
-        </w:numPr>
-        <w:spacing w:before="100" w:beforeAutospacing="1" w:after="100" w:afterAutospacing="1" w:line="240" w:lineRule="auto"/>
-        <w:rPr>
-          <w:rFonts w:ascii="Times New Roman" w:eastAsia="Times New Roman" w:hAnsi="Times New Roman" w:cs="Times New Roman"/>
-          <w:kern w:val="0"/>
-          <w14:ligatures w14:val="none"/>
-        </w:rPr>
-      </w:pPr>
-      <w:r>
-        <w:rPr>
-          <w:rFonts w:ascii="Times New Roman" w:eastAsia="Times New Roman" w:hAnsi="Times New Roman" w:cs="Times New Roman"/>
-          <w:kern w:val="0"/>
-          <w14:ligatures w14:val="none"/>
-        </w:rPr>
-        <w:t>Controlled brand reference table</w:t>
-      </w:r>
-    </w:p>
-    <w:p>
-      <w:pPr>
-        <w:spacing w:before="100" w:beforeAutospacing="1" w:after="100" w:afterAutospacing="1" w:line="240" w:lineRule="auto"/>
-        <w:outlineLvl w:val="2"/>
-        <w:rPr>
-          <w:rFonts w:ascii="Times New Roman" w:eastAsia="Times New Roman" w:hAnsi="Times New Roman" w:cs="Times New Roman"/>
-          <w:kern w:val="0"/>
-          <w14:ligatures w14:val="none"/>
-        </w:rPr>
-      </w:pPr>
-      <w:r>
-        <w:rPr>
-          <w:rFonts w:ascii="Times New Roman" w:eastAsia="Times New Roman" w:hAnsi="Times New Roman" w:cs="Times New Roman"/>
-          <w:kern w:val="0"/>
-          <w14:ligatures w14:val="none"/>
-        </w:rPr>
-        <w:t>data/raw</w:t>
-      </w:r>
-    </w:p>
-    <w:p>
-      <w:pPr>
-        <w:spacing w:before="100" w:beforeAutospacing="1" w:after="100" w:afterAutospacing="1" w:line="240" w:lineRule="auto"/>
-        <w:outlineLvl w:val="2"/>
-        <w:rPr>
-          <w:rFonts w:ascii="Times New Roman" w:eastAsia="Times New Roman" w:hAnsi="Times New Roman" w:cs="Times New Roman"/>
-          <w:kern w:val="0"/>
-          <w14:ligatures w14:val="none"/>
-        </w:rPr>
-      </w:pPr>
-      <w:r>
-        <w:rPr>
-          <w:rFonts w:ascii="Times New Roman" w:eastAsia="Times New Roman" w:hAnsi="Times New Roman" w:cs="Times New Roman"/>
-          <w:kern w:val="0"/>
-          <w14:ligatures w14:val="none"/>
-        </w:rPr>
-        <w:t xml:space="preserve">link to folder on </w:t>
-      </w:r>
-      <w:proofErr w:type="spellStart"/>
-      <w:r>
-        <w:rPr>
-          <w:rFonts w:ascii="Times New Roman" w:eastAsia="Times New Roman" w:hAnsi="Times New Roman" w:cs="Times New Roman"/>
-          <w:kern w:val="0"/>
-          <w14:ligatures w14:val="none"/>
-        </w:rPr>
-        <w:t>github</w:t>
-      </w:r>
-      <w:proofErr w:type="spellEnd"/>
-    </w:p>
-    <w:p>
-      <w:pPr>
-        <w:spacing w:before="100" w:beforeAutospacing="1" w:after="100" w:afterAutospacing="1" w:line="240" w:lineRule="auto"/>
-        <w:rPr>
-          <w:rFonts w:ascii="Times New Roman" w:eastAsia="Times New Roman" w:hAnsi="Times New Roman" w:cs="Times New Roman"/>
-          <w:kern w:val="0"/>
-          <w14:ligatures w14:val="none"/>
-        </w:rPr>
-      </w:pPr>
-      <w:r>
-        <w:rPr>
-          <w:rFonts w:ascii="Times New Roman" w:eastAsia="Times New Roman" w:hAnsi="Times New Roman" w:cs="Times New Roman"/>
-          <w:kern w:val="0"/>
-          <w14:ligatures w14:val="none"/>
-        </w:rPr>
-        <w:t>Raw HTML files downloaded from Pinkbike. These files preserve the original webpage content before any preprocessing is performed.</w:t>
-      </w:r>
-    </w:p>
-    <w:p>
-      <w:pPr>
-        <w:spacing w:before="100" w:beforeAutospacing="1" w:after="100" w:afterAutospacing="1" w:line="240" w:lineRule="auto"/>
-        <w:outlineLvl w:val="2"/>
-        <w:rPr>
-          <w:rFonts w:ascii="Times New Roman" w:eastAsia="Times New Roman" w:hAnsi="Times New Roman" w:cs="Times New Roman"/>
-          <w:kern w:val="0"/>
-          <w14:ligatures w14:val="none"/>
-        </w:rPr>
-      </w:pPr>
-      <w:r>
-        <w:rPr>
-          <w:rFonts w:ascii="Times New Roman" w:eastAsia="Times New Roman" w:hAnsi="Times New Roman" w:cs="Times New Roman"/>
-          <w:kern w:val="0"/>
-          <w14:ligatures w14:val="none"/>
-        </w:rPr>
-        <w:t>data/processed</w:t>
-      </w:r>
-    </w:p>
-    <w:p>
-      <w:pPr>
-        <w:spacing w:before="100" w:beforeAutospacing="1" w:after="100" w:afterAutospacing="1" w:line="240" w:lineRule="auto"/>
-        <w:outlineLvl w:val="2"/>
-        <w:rPr>
-          <w:rFonts w:ascii="Times New Roman" w:eastAsia="Times New Roman" w:hAnsi="Times New Roman" w:cs="Times New Roman"/>
-          <w:kern w:val="0"/>
-          <w14:ligatures w14:val="none"/>
-        </w:rPr>
-      </w:pPr>
-      <w:r>
-        <w:rPr>
-          <w:rFonts w:ascii="Times New Roman" w:eastAsia="Times New Roman" w:hAnsi="Times New Roman" w:cs="Times New Roman"/>
-          <w:kern w:val="0"/>
-          <w14:ligatures w14:val="none"/>
-        </w:rPr>
-        <w:t xml:space="preserve">link to folder on </w:t>
-      </w:r>
-      <w:proofErr w:type="spellStart"/>
-      <w:r>
-        <w:rPr>
-          <w:rFonts w:ascii="Times New Roman" w:eastAsia="Times New Roman" w:hAnsi="Times New Roman" w:cs="Times New Roman"/>
-          <w:kern w:val="0"/>
-          <w14:ligatures w14:val="none"/>
-        </w:rPr>
-        <w:t>github</w:t>
-      </w:r>
-      <w:proofErr w:type="spellEnd"/>
-    </w:p>
-    <w:p>
-      <w:pPr>
-        <w:spacing w:before="100" w:beforeAutospacing="1" w:after="100" w:afterAutospacing="1" w:line="240" w:lineRule="auto"/>
-        <w:rPr>
-          <w:rFonts w:ascii="Times New Roman" w:eastAsia="Times New Roman" w:hAnsi="Times New Roman" w:cs="Times New Roman"/>
-          <w:kern w:val="0"/>
-          <w14:ligatures w14:val="none"/>
-        </w:rPr>
-      </w:pPr>
-      <w:r>
-        <w:rPr>
-          <w:rFonts w:ascii="Times New Roman" w:eastAsia="Times New Roman" w:hAnsi="Times New Roman" w:cs="Times New Roman"/>
-          <w:kern w:val="0"/>
-          <w14:ligatures w14:val="none"/>
-        </w:rPr>
-        <w:t>The final structured review dataset produced by the parsing pipeline. This dataset contains cleaned article text, metadata, extracted product information, and classification fields that will support future NLP modeling.</w:t>
-      </w:r>
-    </w:p>
-    <w:p>
-      <w:pPr>
-        <w:pStyle w:val="Heading3"/>
-        <w:rPr>
-          <w:rFonts w:eastAsia="Times New Roman"/>
-        </w:rPr>
-      </w:pPr>
-      <w:r>
-        <w:rPr>
-          <w:rFonts w:eastAsia="Times New Roman"/>
-        </w:rPr>
-        <w:t>Overall Workflow</w:t>
-      </w:r>
-    </w:p>
-    <w:p>
-      <w:pPr>
-        <w:numPr>
-          <w:ilvl w:val="0"/>
-          <w:numId w:val="7"/>
-        </w:numPr>
-        <w:spacing w:before="100" w:beforeAutospacing="1" w:after="100" w:afterAutospacing="1" w:line="240" w:lineRule="auto"/>
-        <w:rPr>
-          <w:rFonts w:ascii="Times New Roman" w:eastAsia="Times New Roman" w:hAnsi="Times New Roman" w:cs="Times New Roman"/>
-          <w:kern w:val="0"/>
-          <w14:ligatures w14:val="none"/>
-        </w:rPr>
-      </w:pPr>
-      <w:r>
-        <w:rPr>
-          <w:rFonts w:ascii="Times New Roman" w:eastAsia="Times New Roman" w:hAnsi="Times New Roman" w:cs="Times New Roman"/>
-          <w:kern w:val="0"/>
-          <w14:ligatures w14:val="none"/>
-        </w:rPr>
-        <w:t>Discover review article URLs.</w:t>
-      </w:r>
-    </w:p>
-    <w:p>
-      <w:pPr>
-        <w:numPr>
-          <w:ilvl w:val="0"/>
-          <w:numId w:val="7"/>
-        </w:numPr>
-        <w:spacing w:before="100" w:beforeAutospacing="1" w:after="100" w:afterAutospacing="1" w:line="240" w:lineRule="auto"/>
-        <w:rPr>
-          <w:rFonts w:ascii="Times New Roman" w:eastAsia="Times New Roman" w:hAnsi="Times New Roman" w:cs="Times New Roman"/>
-          <w:kern w:val="0"/>
-          <w14:ligatures w14:val="none"/>
-        </w:rPr>
-      </w:pPr>
-      <w:r>
-        <w:rPr>
-          <w:rFonts w:ascii="Times New Roman" w:eastAsia="Times New Roman" w:hAnsi="Times New Roman" w:cs="Times New Roman"/>
-          <w:kern w:val="0"/>
-          <w14:ligatures w14:val="none"/>
-        </w:rPr>
-        <w:t>Build and maintain the master URL reference file.</w:t>
-      </w:r>
-    </w:p>
-    <w:p>
-      <w:pPr>
-        <w:numPr>
-          <w:ilvl w:val="0"/>
-          <w:numId w:val="7"/>
-        </w:numPr>
-        <w:spacing w:before="100" w:beforeAutospacing="1" w:after="100" w:afterAutospacing="1" w:line="240" w:lineRule="auto"/>
-        <w:rPr>
-          <w:rFonts w:ascii="Times New Roman" w:eastAsia="Times New Roman" w:hAnsi="Times New Roman" w:cs="Times New Roman"/>
-          <w:kern w:val="0"/>
-          <w14:ligatures w14:val="none"/>
-        </w:rPr>
-      </w:pPr>
-      <w:r>
-        <w:rPr>
-          <w:rFonts w:ascii="Times New Roman" w:eastAsia="Times New Roman" w:hAnsi="Times New Roman" w:cs="Times New Roman"/>
-          <w:kern w:val="0"/>
-          <w14:ligatures w14:val="none"/>
-        </w:rPr>
-        <w:t>Download raw HTML for new review articles.</w:t>
-      </w:r>
-    </w:p>
-    <w:p>
-      <w:pPr>
-        <w:numPr>
-          <w:ilvl w:val="0"/>
-          <w:numId w:val="7"/>
-        </w:numPr>
-        <w:spacing w:before="100" w:beforeAutospacing="1" w:after="100" w:afterAutospacing="1" w:line="240" w:lineRule="auto"/>
-        <w:rPr>
-          <w:rFonts w:ascii="Times New Roman" w:eastAsia="Times New Roman" w:hAnsi="Times New Roman" w:cs="Times New Roman"/>
-          <w:kern w:val="0"/>
-          <w14:ligatures w14:val="none"/>
-        </w:rPr>
-      </w:pPr>
-      <w:r>
-        <w:rPr>
-          <w:rFonts w:ascii="Times New Roman" w:eastAsia="Times New Roman" w:hAnsi="Times New Roman" w:cs="Times New Roman"/>
-          <w:kern w:val="0"/>
-          <w14:ligatures w14:val="none"/>
-        </w:rPr>
-        <w:t>Parse HTML into structured review records.</w:t>
-      </w:r>
-    </w:p>
-    <w:p>
-      <w:pPr>
-        <w:numPr>
-          <w:ilvl w:val="0"/>
-          <w:numId w:val="7"/>
-        </w:numPr>
-        <w:spacing w:before="100" w:beforeAutospacing="1" w:after="100" w:afterAutospacing="1" w:line="240" w:lineRule="auto"/>
-        <w:rPr>
-          <w:rFonts w:ascii="Times New Roman" w:eastAsia="Times New Roman" w:hAnsi="Times New Roman" w:cs="Times New Roman"/>
-          <w:kern w:val="0"/>
-          <w14:ligatures w14:val="none"/>
-        </w:rPr>
-      </w:pPr>
-      <w:r>
-        <w:rPr>
-          <w:rFonts w:ascii="Times New Roman" w:eastAsia="Times New Roman" w:hAnsi="Times New Roman" w:cs="Times New Roman"/>
-          <w:kern w:val="0"/>
-          <w14:ligatures w14:val="none"/>
-        </w:rPr>
-        <w:t>Clean article text and extract product information.</w:t>
-      </w:r>
-    </w:p>
-    <w:p>
-      <w:pPr>
-        <w:numPr>
-          <w:ilvl w:val="0"/>
-          <w:numId w:val="7"/>
-        </w:numPr>
-        <w:spacing w:before="100" w:beforeAutospacing="1" w:after="100" w:afterAutospacing="1" w:line="240" w:lineRule="auto"/>
-        <w:rPr>
-          <w:rFonts w:ascii="Times New Roman" w:eastAsia="Times New Roman" w:hAnsi="Times New Roman" w:cs="Times New Roman"/>
-          <w:kern w:val="0"/>
-          <w14:ligatures w14:val="none"/>
-        </w:rPr>
-      </w:pPr>
-      <w:r>
-        <w:rPr>
-          <w:rFonts w:ascii="Times New Roman" w:eastAsia="Times New Roman" w:hAnsi="Times New Roman" w:cs="Times New Roman"/>
-          <w:kern w:val="0"/>
-          <w14:ligatures w14:val="none"/>
-        </w:rPr>
-        <w:t>Produce a structured dataset for sentiment analysis and machine learning.</w:t>
-      </w:r>
-    </w:p>
-    <w:p>
-      <w:pPr>
-        <w:spacing w:before="100" w:beforeAutospacing="1" w:after="100" w:afterAutospacing="1" w:line="240" w:lineRule="auto"/>
-        <w:rPr>
-          <w:rFonts w:ascii="Times New Roman" w:eastAsia="Times New Roman" w:hAnsi="Times New Roman" w:cs="Times New Roman"/>
-          <w:kern w:val="0"/>
-          <w14:ligatures w14:val="none"/>
-        </w:rPr>
-      </w:pPr>
-      <w:r>
-        <w:rPr>
-          <w:rFonts w:ascii="Times New Roman" w:eastAsia="Times New Roman" w:hAnsi="Times New Roman" w:cs="Times New Roman"/>
-          <w:kern w:val="0"/>
-          <w14:ligatures w14:val="none"/>
-        </w:rPr>
-        <w:t>This modular workflow separates data collection from preprocessing, making the pipeline easier to maintain, validate, and extend.</w:t>
-      </w:r>
-    </w:p>
-    <w:p>
-      <w:pPr>
-        <w:pStyle w:val="Heading3"/>
-        <w:rPr>
-          <w:rFonts w:eastAsia="Times New Roman"/>
-        </w:rPr>
-      </w:pPr>
-      <w:r>
-        <w:rPr>
-          <w:rFonts w:eastAsia="Times New Roman"/>
-        </w:rPr>
-        <w:t>AI Use Documentation</w:t>
-      </w:r>
-    </w:p>
-    <w:p>
-      <w:pPr>
-        <w:spacing w:before="100" w:beforeAutospacing="1" w:after="100" w:afterAutospacing="1" w:line="240" w:lineRule="auto"/>
-        <w:rPr>
-          <w:rFonts w:ascii="Times New Roman" w:eastAsia="Times New Roman" w:hAnsi="Times New Roman" w:cs="Times New Roman"/>
-          <w:kern w:val="0"/>
-          <w14:ligatures w14:val="none"/>
-        </w:rPr>
-      </w:pPr>
-      <w:r>
-        <w:rPr>
-          <w:rFonts w:ascii="Times New Roman" w:eastAsia="Times New Roman" w:hAnsi="Times New Roman" w:cs="Times New Roman"/>
-          <w:kern w:val="0"/>
-          <w14:ligatures w14:val="none"/>
-        </w:rPr>
-        <w:t xml:space="preserve">AI </w:t>
-      </w:r>
-      <w:r>
-        <w:rPr>
-          <w:rFonts w:ascii="Times New Roman" w:eastAsia="Times New Roman" w:hAnsi="Times New Roman" w:cs="Times New Roman"/>
-          <w:kern w:val="0"/>
-          <w14:ligatures w14:val="none"/>
-        </w:rPr>
-        <w:t>tools were used throughout development to assist with</w:t>
-      </w:r>
-      <w:r>
-        <w:rPr>
-          <w:rFonts w:ascii="Times New Roman" w:eastAsia="Times New Roman" w:hAnsi="Times New Roman" w:cs="Times New Roman"/>
-          <w:kern w:val="0"/>
-          <w14:ligatures w14:val="none"/>
-        </w:rPr>
-        <w:t xml:space="preserve"> the following</w:t>
-      </w:r>
-    </w:p>
-    <w:p>
-      <w:pPr>
-        <w:numPr>
-          <w:ilvl w:val="0"/>
-          <w:numId w:val="8"/>
-        </w:numPr>
-        <w:spacing w:before="100" w:beforeAutospacing="1" w:after="100" w:afterAutospacing="1" w:line="240" w:lineRule="auto"/>
-        <w:rPr>
-          <w:rFonts w:ascii="Times New Roman" w:eastAsia="Times New Roman" w:hAnsi="Times New Roman" w:cs="Times New Roman"/>
-          <w:kern w:val="0"/>
-          <w14:ligatures w14:val="none"/>
-        </w:rPr>
-      </w:pPr>
-      <w:r>
-        <w:rPr>
-          <w:rFonts w:ascii="Times New Roman" w:eastAsia="Times New Roman" w:hAnsi="Times New Roman" w:cs="Times New Roman"/>
-          <w:kern w:val="0"/>
-          <w14:ligatures w14:val="none"/>
-        </w:rPr>
-        <w:t>Code organization and refactoring</w:t>
-      </w:r>
-    </w:p>
-    <w:p>
-      <w:pPr>
-        <w:numPr>
-          <w:ilvl w:val="0"/>
-          <w:numId w:val="8"/>
-        </w:numPr>
-        <w:spacing w:before="100" w:beforeAutospacing="1" w:after="100" w:afterAutospacing="1" w:line="240" w:lineRule="auto"/>
-        <w:rPr>
-          <w:rFonts w:ascii="Times New Roman" w:eastAsia="Times New Roman" w:hAnsi="Times New Roman" w:cs="Times New Roman"/>
-          <w:kern w:val="0"/>
-          <w14:ligatures w14:val="none"/>
-        </w:rPr>
-      </w:pPr>
-      <w:r>
-        <w:rPr>
-          <w:rFonts w:ascii="Times New Roman" w:eastAsia="Times New Roman" w:hAnsi="Times New Roman" w:cs="Times New Roman"/>
-          <w:kern w:val="0"/>
-          <w14:ligatures w14:val="none"/>
-        </w:rPr>
-        <w:t>Debugging and troubleshooting</w:t>
-      </w:r>
-    </w:p>
-    <w:p>
-      <w:pPr>
-        <w:numPr>
-          <w:ilvl w:val="0"/>
-          <w:numId w:val="8"/>
-        </w:numPr>
-        <w:spacing w:before="100" w:beforeAutospacing="1" w:after="100" w:afterAutospacing="1" w:line="240" w:lineRule="auto"/>
-        <w:rPr>
-          <w:rFonts w:ascii="Times New Roman" w:eastAsia="Times New Roman" w:hAnsi="Times New Roman" w:cs="Times New Roman"/>
-          <w:kern w:val="0"/>
-          <w14:ligatures w14:val="none"/>
-        </w:rPr>
-      </w:pPr>
-      <w:r>
-        <w:rPr>
-          <w:rFonts w:ascii="Times New Roman" w:eastAsia="Times New Roman" w:hAnsi="Times New Roman" w:cs="Times New Roman"/>
-          <w:kern w:val="0"/>
-          <w14:ligatures w14:val="none"/>
-        </w:rPr>
-        <w:t>Writing and improving comments and documentation</w:t>
-      </w:r>
-    </w:p>
-    <w:p>
-      <w:pPr>
-        <w:pStyle w:val="Heading3"/>
-        <w:rPr>
-          <w:rFonts w:eastAsia="Times New Roman"/>
-        </w:rPr>
-      </w:pPr>
-      <w:r>
-        <w:rPr>
-          <w:rFonts w:eastAsia="Times New Roman"/>
+        <w:pStyle w:val="Heading2"/>
+        <w:rPr>
+          <w:rFonts w:ascii="Times New Roman" w:eastAsia="Times New Roman" w:hAnsi="Times New Roman" w:cs="Times New Roman"/>
+        </w:rPr>
+      </w:pPr>
+      <w:r>
+        <w:rPr>
+          <w:rFonts w:ascii="Times New Roman" w:eastAsia="Times New Roman" w:hAnsi="Times New Roman" w:cs="Times New Roman"/>
         </w:rPr>
         <w:t>Code Repository</w:t>
       </w:r>
@@ -1475,15 +95,7 @@
           <w:kern w:val="0"/>
           <w14:ligatures w14:val="none"/>
         </w:rPr>
-        <w:t>GitHub Repository:</w:t>
-      </w:r>
-      <w:r>
-        <w:rPr>
-          <w:rFonts w:ascii="Times New Roman" w:eastAsia="Times New Roman" w:hAnsi="Times New Roman" w:cs="Times New Roman"/>
-          <w:kern w:val="0"/>
-          <w14:ligatures w14:val="none"/>
-        </w:rPr>
-        <w:t xml:space="preserve"> </w:t>
+        <w:t xml:space="preserve">GitHub Repository: </w:t>
       </w:r>
       <w:hyperlink r:id="rId5" w:history="1">
         <w:r>
@@ -1496,6 +108,1812 @@
           <w:t>https://github.com/Austin-Engstrom/capstone-ds785</w:t>
         </w:r>
       </w:hyperlink>
+    </w:p>
+    <w:p>
+      <w:pPr>
+        <w:pStyle w:val="Heading2"/>
+        <w:rPr>
+          <w:rFonts w:ascii="Times New Roman" w:eastAsia="Times New Roman" w:hAnsi="Times New Roman" w:cs="Times New Roman"/>
+        </w:rPr>
+      </w:pPr>
+      <w:r>
+        <w:rPr>
+          <w:rFonts w:ascii="Times New Roman" w:eastAsia="Times New Roman" w:hAnsi="Times New Roman" w:cs="Times New Roman"/>
+        </w:rPr>
+        <w:t>Code Organization</w:t>
+      </w:r>
+    </w:p>
+    <w:p>
+      <w:pPr>
+        <w:spacing w:before="100" w:beforeAutospacing="1" w:after="100" w:afterAutospacing="1" w:line="240" w:lineRule="auto"/>
+        <w:rPr>
+          <w:rFonts w:ascii="Times New Roman" w:eastAsia="Times New Roman" w:hAnsi="Times New Roman" w:cs="Times New Roman"/>
+          <w:kern w:val="0"/>
+          <w14:ligatures w14:val="none"/>
+        </w:rPr>
+      </w:pPr>
+      <w:r>
+        <w:rPr>
+          <w:rFonts w:ascii="Times New Roman" w:eastAsia="Times New Roman" w:hAnsi="Times New Roman" w:cs="Times New Roman"/>
+          <w:kern w:val="0"/>
+          <w14:ligatures w14:val="none"/>
+        </w:rPr>
+        <w:t>The project is organized into the following primary Python modules.</w:t>
+      </w:r>
+    </w:p>
+    <w:p>
+      <w:pPr>
+        <w:pStyle w:val="Heading3"/>
+        <w:rPr>
+          <w:rFonts w:ascii="Times New Roman" w:eastAsia="Times New Roman" w:hAnsi="Times New Roman" w:cs="Times New Roman"/>
+        </w:rPr>
+      </w:pPr>
+      <w:hyperlink r:id="rId6" w:history="1">
+        <w:r>
+          <w:rPr>
+            <w:rStyle w:val="Hyperlink"/>
+            <w:rFonts w:ascii="Times New Roman" w:eastAsia="Times New Roman" w:hAnsi="Times New Roman" w:cs="Times New Roman"/>
+          </w:rPr>
+          <w:t>con</w:t>
+        </w:r>
+        <w:r>
+          <w:rPr>
+            <w:rStyle w:val="Hyperlink"/>
+            <w:rFonts w:ascii="Times New Roman" w:eastAsia="Times New Roman" w:hAnsi="Times New Roman" w:cs="Times New Roman"/>
+          </w:rPr>
+          <w:t>f</w:t>
+        </w:r>
+        <w:r>
+          <w:rPr>
+            <w:rStyle w:val="Hyperlink"/>
+            <w:rFonts w:ascii="Times New Roman" w:eastAsia="Times New Roman" w:hAnsi="Times New Roman" w:cs="Times New Roman"/>
+          </w:rPr>
+          <w:t>ig.py</w:t>
+        </w:r>
+      </w:hyperlink>
+    </w:p>
+    <w:p>
+      <w:pPr>
+        <w:rPr>
+          <w:rFonts w:ascii="Times New Roman" w:hAnsi="Times New Roman" w:cs="Times New Roman"/>
+        </w:rPr>
+      </w:pPr>
+      <w:r>
+        <w:rPr>
+          <w:rFonts w:ascii="Times New Roman" w:hAnsi="Times New Roman" w:cs="Times New Roman"/>
+        </w:rPr>
+        <w:t>This file centralizes project paths, scraper settings, browser settings,</w:t>
+      </w:r>
+      <w:r>
+        <w:rPr>
+          <w:rFonts w:ascii="Times New Roman" w:hAnsi="Times New Roman" w:cs="Times New Roman"/>
+        </w:rPr>
+        <w:t xml:space="preserve"> </w:t>
+      </w:r>
+      <w:r>
+        <w:rPr>
+          <w:rFonts w:ascii="Times New Roman" w:hAnsi="Times New Roman" w:cs="Times New Roman"/>
+        </w:rPr>
+        <w:t>input/output file locations, and directory creation logic. Keeping these</w:t>
+      </w:r>
+      <w:r>
+        <w:rPr>
+          <w:rFonts w:ascii="Times New Roman" w:hAnsi="Times New Roman" w:cs="Times New Roman"/>
+        </w:rPr>
+        <w:t xml:space="preserve"> </w:t>
+      </w:r>
+      <w:r>
+        <w:rPr>
+          <w:rFonts w:ascii="Times New Roman" w:hAnsi="Times New Roman" w:cs="Times New Roman"/>
+        </w:rPr>
+        <w:t>values in one place makes the scraping and parsing scripts easier to update,</w:t>
+      </w:r>
+      <w:r>
+        <w:rPr>
+          <w:rFonts w:ascii="Times New Roman" w:hAnsi="Times New Roman" w:cs="Times New Roman"/>
+        </w:rPr>
+        <w:t xml:space="preserve"> </w:t>
+      </w:r>
+      <w:r>
+        <w:rPr>
+          <w:rFonts w:ascii="Times New Roman" w:hAnsi="Times New Roman" w:cs="Times New Roman"/>
+        </w:rPr>
+        <w:t>reuse, and troubleshoot.</w:t>
+      </w:r>
+    </w:p>
+    <w:p>
+      <w:pPr>
+        <w:numPr>
+          <w:ilvl w:val="0"/>
+          <w:numId w:val="1"/>
+        </w:numPr>
+        <w:spacing w:before="100" w:beforeAutospacing="1" w:after="100" w:afterAutospacing="1" w:line="240" w:lineRule="auto"/>
+        <w:rPr>
+          <w:rFonts w:ascii="Times New Roman" w:eastAsia="Times New Roman" w:hAnsi="Times New Roman" w:cs="Times New Roman"/>
+          <w:kern w:val="0"/>
+          <w14:ligatures w14:val="none"/>
+        </w:rPr>
+      </w:pPr>
+      <w:r>
+        <w:rPr>
+          <w:rFonts w:ascii="Times New Roman" w:eastAsia="Times New Roman" w:hAnsi="Times New Roman" w:cs="Times New Roman"/>
+          <w:kern w:val="0"/>
+          <w14:ligatures w14:val="none"/>
+        </w:rPr>
+        <w:t>Project directory structure</w:t>
+      </w:r>
+    </w:p>
+    <w:p>
+      <w:pPr>
+        <w:numPr>
+          <w:ilvl w:val="0"/>
+          <w:numId w:val="1"/>
+        </w:numPr>
+        <w:spacing w:before="100" w:beforeAutospacing="1" w:after="100" w:afterAutospacing="1" w:line="240" w:lineRule="auto"/>
+        <w:rPr>
+          <w:rFonts w:ascii="Times New Roman" w:eastAsia="Times New Roman" w:hAnsi="Times New Roman" w:cs="Times New Roman"/>
+          <w:kern w:val="0"/>
+          <w14:ligatures w14:val="none"/>
+        </w:rPr>
+      </w:pPr>
+      <w:r>
+        <w:rPr>
+          <w:rFonts w:ascii="Times New Roman" w:eastAsia="Times New Roman" w:hAnsi="Times New Roman" w:cs="Times New Roman"/>
+          <w:kern w:val="0"/>
+          <w14:ligatures w14:val="none"/>
+        </w:rPr>
+        <w:t>Input and output file locations</w:t>
+      </w:r>
+    </w:p>
+    <w:p>
+      <w:pPr>
+        <w:numPr>
+          <w:ilvl w:val="0"/>
+          <w:numId w:val="1"/>
+        </w:numPr>
+        <w:spacing w:before="100" w:beforeAutospacing="1" w:after="100" w:afterAutospacing="1" w:line="240" w:lineRule="auto"/>
+        <w:rPr>
+          <w:rFonts w:ascii="Times New Roman" w:eastAsia="Times New Roman" w:hAnsi="Times New Roman" w:cs="Times New Roman"/>
+          <w:kern w:val="0"/>
+          <w14:ligatures w14:val="none"/>
+        </w:rPr>
+      </w:pPr>
+      <w:r>
+        <w:rPr>
+          <w:rFonts w:ascii="Times New Roman" w:eastAsia="Times New Roman" w:hAnsi="Times New Roman" w:cs="Times New Roman"/>
+          <w:kern w:val="0"/>
+          <w14:ligatures w14:val="none"/>
+        </w:rPr>
+        <w:t>Browser and scraper settings</w:t>
+      </w:r>
+    </w:p>
+    <w:p>
+      <w:pPr>
+        <w:numPr>
+          <w:ilvl w:val="0"/>
+          <w:numId w:val="1"/>
+        </w:numPr>
+        <w:spacing w:before="100" w:beforeAutospacing="1" w:after="100" w:afterAutospacing="1" w:line="240" w:lineRule="auto"/>
+        <w:rPr>
+          <w:rFonts w:ascii="Times New Roman" w:eastAsia="Times New Roman" w:hAnsi="Times New Roman" w:cs="Times New Roman"/>
+          <w:kern w:val="0"/>
+          <w14:ligatures w14:val="none"/>
+        </w:rPr>
+      </w:pPr>
+      <w:r>
+        <w:rPr>
+          <w:rFonts w:ascii="Times New Roman" w:eastAsia="Times New Roman" w:hAnsi="Times New Roman" w:cs="Times New Roman"/>
+          <w:kern w:val="0"/>
+          <w14:ligatures w14:val="none"/>
+        </w:rPr>
+        <w:t>Shared project constants</w:t>
+      </w:r>
+    </w:p>
+    <w:p>
+      <w:pPr>
+        <w:spacing w:before="100" w:beforeAutospacing="1" w:after="100" w:afterAutospacing="1" w:line="240" w:lineRule="auto"/>
+        <w:rPr>
+          <w:rFonts w:ascii="Times New Roman" w:eastAsia="Times New Roman" w:hAnsi="Times New Roman" w:cs="Times New Roman"/>
+          <w:kern w:val="0"/>
+          <w14:ligatures w14:val="none"/>
+        </w:rPr>
+      </w:pPr>
+      <w:r>
+        <w:rPr>
+          <w:rFonts w:ascii="Times New Roman" w:eastAsia="Times New Roman" w:hAnsi="Times New Roman" w:cs="Times New Roman"/>
+          <w:kern w:val="0"/>
+          <w14:ligatures w14:val="none"/>
+        </w:rPr>
+        <w:t>Using a centralized configuration file allows changes to be made in one location rather than throughout multiple scripts.</w:t>
+      </w:r>
+    </w:p>
+    <w:p>
+      <w:pPr>
+        <w:pStyle w:val="Heading3"/>
+        <w:rPr>
+          <w:rFonts w:ascii="Times New Roman" w:eastAsia="Times New Roman" w:hAnsi="Times New Roman" w:cs="Times New Roman"/>
+        </w:rPr>
+      </w:pPr>
+      <w:hyperlink r:id="rId7" w:history="1">
+        <w:r>
+          <w:rPr>
+            <w:rStyle w:val="Hyperlink"/>
+            <w:rFonts w:ascii="Times New Roman" w:eastAsia="Times New Roman" w:hAnsi="Times New Roman" w:cs="Times New Roman"/>
+          </w:rPr>
+          <w:t>utils.py</w:t>
+        </w:r>
+      </w:hyperlink>
+    </w:p>
+    <w:p>
+      <w:pPr>
+        <w:spacing w:before="100" w:beforeAutospacing="1" w:after="100" w:afterAutospacing="1" w:line="240" w:lineRule="auto"/>
+        <w:rPr>
+          <w:rFonts w:ascii="Times New Roman" w:eastAsia="Times New Roman" w:hAnsi="Times New Roman" w:cs="Times New Roman"/>
+          <w:kern w:val="0"/>
+          <w14:ligatures w14:val="none"/>
+        </w:rPr>
+      </w:pPr>
+      <w:r>
+        <w:rPr>
+          <w:rFonts w:ascii="Times New Roman" w:eastAsia="Times New Roman" w:hAnsi="Times New Roman" w:cs="Times New Roman"/>
+          <w:kern w:val="0"/>
+          <w14:ligatures w14:val="none"/>
+        </w:rPr>
+        <w:t>This file contains reusable utility functions used across the scraping and parsing workflow. These functions support URL standardization and safe local file naming, which help make the data collection process more consistent and repeatable.</w:t>
+      </w:r>
+    </w:p>
+    <w:p>
+      <w:pPr>
+        <w:numPr>
+          <w:ilvl w:val="0"/>
+          <w:numId w:val="2"/>
+        </w:numPr>
+        <w:spacing w:before="100" w:beforeAutospacing="1" w:after="100" w:afterAutospacing="1" w:line="240" w:lineRule="auto"/>
+        <w:rPr>
+          <w:rFonts w:ascii="Times New Roman" w:eastAsia="Times New Roman" w:hAnsi="Times New Roman" w:cs="Times New Roman"/>
+          <w:kern w:val="0"/>
+          <w14:ligatures w14:val="none"/>
+        </w:rPr>
+      </w:pPr>
+      <w:r>
+        <w:rPr>
+          <w:rFonts w:ascii="Times New Roman" w:eastAsia="Times New Roman" w:hAnsi="Times New Roman" w:cs="Times New Roman"/>
+          <w:kern w:val="0"/>
+          <w14:ligatures w14:val="none"/>
+        </w:rPr>
+        <w:lastRenderedPageBreak/>
+        <w:t>URL normalization for duplicate detection</w:t>
+      </w:r>
+    </w:p>
+    <w:p>
+      <w:pPr>
+        <w:numPr>
+          <w:ilvl w:val="0"/>
+          <w:numId w:val="2"/>
+        </w:numPr>
+        <w:spacing w:before="100" w:beforeAutospacing="1" w:after="100" w:afterAutospacing="1" w:line="240" w:lineRule="auto"/>
+        <w:rPr>
+          <w:rFonts w:ascii="Times New Roman" w:eastAsia="Times New Roman" w:hAnsi="Times New Roman" w:cs="Times New Roman"/>
+          <w:kern w:val="0"/>
+          <w14:ligatures w14:val="none"/>
+        </w:rPr>
+      </w:pPr>
+      <w:r>
+        <w:rPr>
+          <w:rFonts w:ascii="Times New Roman" w:eastAsia="Times New Roman" w:hAnsi="Times New Roman" w:cs="Times New Roman"/>
+          <w:kern w:val="0"/>
+          <w14:ligatures w14:val="none"/>
+        </w:rPr>
+        <w:t>Safe HTML filename generation</w:t>
+      </w:r>
+    </w:p>
+    <w:p>
+      <w:pPr>
+        <w:spacing w:before="100" w:beforeAutospacing="1" w:after="100" w:afterAutospacing="1" w:line="240" w:lineRule="auto"/>
+        <w:rPr>
+          <w:rFonts w:ascii="Times New Roman" w:eastAsia="Times New Roman" w:hAnsi="Times New Roman" w:cs="Times New Roman"/>
+          <w:kern w:val="0"/>
+          <w14:ligatures w14:val="none"/>
+        </w:rPr>
+      </w:pPr>
+      <w:r>
+        <w:rPr>
+          <w:rFonts w:ascii="Times New Roman" w:eastAsia="Times New Roman" w:hAnsi="Times New Roman" w:cs="Times New Roman"/>
+          <w:kern w:val="0"/>
+          <w14:ligatures w14:val="none"/>
+        </w:rPr>
+        <w:t>These shared utilities reduce duplicated code and improve consistency throughout the pipeline.</w:t>
+      </w:r>
+    </w:p>
+    <w:p>
+      <w:pPr>
+        <w:pStyle w:val="Heading3"/>
+        <w:rPr>
+          <w:rFonts w:ascii="Times New Roman" w:eastAsia="Times New Roman" w:hAnsi="Times New Roman" w:cs="Times New Roman"/>
+        </w:rPr>
+      </w:pPr>
+      <w:hyperlink r:id="rId8" w:history="1">
+        <w:r>
+          <w:rPr>
+            <w:rStyle w:val="Hyperlink"/>
+            <w:rFonts w:ascii="Times New Roman" w:eastAsia="Times New Roman" w:hAnsi="Times New Roman" w:cs="Times New Roman"/>
+          </w:rPr>
+          <w:t>discover_links.py</w:t>
+        </w:r>
+      </w:hyperlink>
+    </w:p>
+    <w:p>
+      <w:pPr>
+        <w:spacing w:before="100" w:beforeAutospacing="1" w:after="100" w:afterAutospacing="1" w:line="240" w:lineRule="auto"/>
+        <w:rPr>
+          <w:rFonts w:ascii="Times New Roman" w:hAnsi="Times New Roman" w:cs="Times New Roman"/>
+        </w:rPr>
+      </w:pPr>
+      <w:r>
+        <w:rPr>
+          <w:rFonts w:ascii="Times New Roman" w:hAnsi="Times New Roman" w:cs="Times New Roman"/>
+        </w:rPr>
+        <w:t>This script supports the data collection stage of the project. It visits the</w:t>
+      </w:r>
+      <w:r>
+        <w:rPr>
+          <w:rFonts w:ascii="Times New Roman" w:hAnsi="Times New Roman" w:cs="Times New Roman"/>
+        </w:rPr>
+        <w:t xml:space="preserve"> </w:t>
+      </w:r>
+      <w:r>
+        <w:rPr>
+          <w:rFonts w:ascii="Times New Roman" w:hAnsi="Times New Roman" w:cs="Times New Roman"/>
+        </w:rPr>
+        <w:t>Pinkbike reviews tag page, scrolls the page to load article links, extracts</w:t>
+      </w:r>
+      <w:r>
+        <w:rPr>
+          <w:rFonts w:ascii="Times New Roman" w:hAnsi="Times New Roman" w:cs="Times New Roman"/>
+        </w:rPr>
+        <w:t xml:space="preserve"> </w:t>
+      </w:r>
+      <w:r>
+        <w:rPr>
+          <w:rFonts w:ascii="Times New Roman" w:hAnsi="Times New Roman" w:cs="Times New Roman"/>
+        </w:rPr>
+        <w:t>candidate review article URLs, removes duplicates, and saves the updated</w:t>
+      </w:r>
+      <w:r>
+        <w:rPr>
+          <w:rFonts w:ascii="Times New Roman" w:hAnsi="Times New Roman" w:cs="Times New Roman"/>
+        </w:rPr>
+        <w:t xml:space="preserve"> </w:t>
+      </w:r>
+      <w:r>
+        <w:rPr>
+          <w:rFonts w:ascii="Times New Roman" w:hAnsi="Times New Roman" w:cs="Times New Roman"/>
+        </w:rPr>
+        <w:t>master list of review links. This allows for new articles to be discovered and added to the dataset over time.</w:t>
+      </w:r>
+      <w:r>
+        <w:rPr>
+          <w:rFonts w:ascii="Times New Roman" w:hAnsi="Times New Roman" w:cs="Times New Roman"/>
+        </w:rPr>
+        <w:t xml:space="preserve"> </w:t>
+      </w:r>
+      <w:r>
+        <w:rPr>
+          <w:rFonts w:ascii="Times New Roman" w:hAnsi="Times New Roman" w:cs="Times New Roman"/>
+        </w:rPr>
+        <w:t>The resulting review_links.csv file is used by scrape_articles.py to download</w:t>
+      </w:r>
+      <w:r>
+        <w:rPr>
+          <w:rFonts w:ascii="Times New Roman" w:hAnsi="Times New Roman" w:cs="Times New Roman"/>
+        </w:rPr>
+        <w:t xml:space="preserve"> </w:t>
+      </w:r>
+      <w:r>
+        <w:rPr>
+          <w:rFonts w:ascii="Times New Roman" w:hAnsi="Times New Roman" w:cs="Times New Roman"/>
+        </w:rPr>
+        <w:t>individual article HTML files.</w:t>
+      </w:r>
+      <w:r>
+        <w:rPr>
+          <w:rFonts w:ascii="Times New Roman" w:hAnsi="Times New Roman" w:cs="Times New Roman"/>
+        </w:rPr>
+        <w:t xml:space="preserve"> </w:t>
+      </w:r>
+    </w:p>
+    <w:p>
+      <w:pPr>
+        <w:numPr>
+          <w:ilvl w:val="0"/>
+          <w:numId w:val="3"/>
+        </w:numPr>
+        <w:spacing w:before="100" w:beforeAutospacing="1" w:after="100" w:afterAutospacing="1" w:line="240" w:lineRule="auto"/>
+        <w:rPr>
+          <w:rFonts w:ascii="Times New Roman" w:eastAsia="Times New Roman" w:hAnsi="Times New Roman" w:cs="Times New Roman"/>
+          <w:kern w:val="0"/>
+          <w14:ligatures w14:val="none"/>
+        </w:rPr>
+      </w:pPr>
+      <w:r>
+        <w:rPr>
+          <w:rFonts w:ascii="Times New Roman" w:eastAsia="Times New Roman" w:hAnsi="Times New Roman" w:cs="Times New Roman"/>
+          <w:kern w:val="0"/>
+          <w14:ligatures w14:val="none"/>
+        </w:rPr>
+        <w:t>Visit</w:t>
+      </w:r>
+      <w:r>
+        <w:rPr>
+          <w:rFonts w:ascii="Times New Roman" w:eastAsia="Times New Roman" w:hAnsi="Times New Roman" w:cs="Times New Roman"/>
+          <w:kern w:val="0"/>
+          <w14:ligatures w14:val="none"/>
+        </w:rPr>
+        <w:t>s</w:t>
+      </w:r>
+      <w:r>
+        <w:rPr>
+          <w:rFonts w:ascii="Times New Roman" w:eastAsia="Times New Roman" w:hAnsi="Times New Roman" w:cs="Times New Roman"/>
+          <w:kern w:val="0"/>
+          <w14:ligatures w14:val="none"/>
+        </w:rPr>
+        <w:t xml:space="preserve"> the Pinkbike Reviews page</w:t>
+      </w:r>
+    </w:p>
+    <w:p>
+      <w:pPr>
+        <w:numPr>
+          <w:ilvl w:val="0"/>
+          <w:numId w:val="3"/>
+        </w:numPr>
+        <w:spacing w:before="100" w:beforeAutospacing="1" w:after="100" w:afterAutospacing="1" w:line="240" w:lineRule="auto"/>
+        <w:rPr>
+          <w:rFonts w:ascii="Times New Roman" w:eastAsia="Times New Roman" w:hAnsi="Times New Roman" w:cs="Times New Roman"/>
+          <w:kern w:val="0"/>
+          <w14:ligatures w14:val="none"/>
+        </w:rPr>
+      </w:pPr>
+      <w:r>
+        <w:rPr>
+          <w:rFonts w:ascii="Times New Roman" w:eastAsia="Times New Roman" w:hAnsi="Times New Roman" w:cs="Times New Roman"/>
+          <w:kern w:val="0"/>
+          <w14:ligatures w14:val="none"/>
+        </w:rPr>
+        <w:t>Automatically scroll</w:t>
+      </w:r>
+      <w:r>
+        <w:rPr>
+          <w:rFonts w:ascii="Times New Roman" w:eastAsia="Times New Roman" w:hAnsi="Times New Roman" w:cs="Times New Roman"/>
+          <w:kern w:val="0"/>
+          <w14:ligatures w14:val="none"/>
+        </w:rPr>
+        <w:t>s</w:t>
+      </w:r>
+      <w:r>
+        <w:rPr>
+          <w:rFonts w:ascii="Times New Roman" w:eastAsia="Times New Roman" w:hAnsi="Times New Roman" w:cs="Times New Roman"/>
+          <w:kern w:val="0"/>
+          <w14:ligatures w14:val="none"/>
+        </w:rPr>
+        <w:t xml:space="preserve"> to load available review articles</w:t>
+      </w:r>
+    </w:p>
+    <w:p>
+      <w:pPr>
+        <w:numPr>
+          <w:ilvl w:val="0"/>
+          <w:numId w:val="3"/>
+        </w:numPr>
+        <w:spacing w:before="100" w:beforeAutospacing="1" w:after="100" w:afterAutospacing="1" w:line="240" w:lineRule="auto"/>
+        <w:rPr>
+          <w:rFonts w:ascii="Times New Roman" w:eastAsia="Times New Roman" w:hAnsi="Times New Roman" w:cs="Times New Roman"/>
+          <w:kern w:val="0"/>
+          <w14:ligatures w14:val="none"/>
+        </w:rPr>
+      </w:pPr>
+      <w:r>
+        <w:rPr>
+          <w:rFonts w:ascii="Times New Roman" w:eastAsia="Times New Roman" w:hAnsi="Times New Roman" w:cs="Times New Roman"/>
+          <w:kern w:val="0"/>
+          <w14:ligatures w14:val="none"/>
+        </w:rPr>
+        <w:t>Extract</w:t>
+      </w:r>
+      <w:r>
+        <w:rPr>
+          <w:rFonts w:ascii="Times New Roman" w:eastAsia="Times New Roman" w:hAnsi="Times New Roman" w:cs="Times New Roman"/>
+          <w:kern w:val="0"/>
+          <w14:ligatures w14:val="none"/>
+        </w:rPr>
+        <w:t>s</w:t>
+      </w:r>
+      <w:r>
+        <w:rPr>
+          <w:rFonts w:ascii="Times New Roman" w:eastAsia="Times New Roman" w:hAnsi="Times New Roman" w:cs="Times New Roman"/>
+          <w:kern w:val="0"/>
+          <w14:ligatures w14:val="none"/>
+        </w:rPr>
+        <w:t xml:space="preserve"> candidate review URLs</w:t>
+      </w:r>
+    </w:p>
+    <w:p>
+      <w:pPr>
+        <w:numPr>
+          <w:ilvl w:val="0"/>
+          <w:numId w:val="3"/>
+        </w:numPr>
+        <w:spacing w:before="100" w:beforeAutospacing="1" w:after="100" w:afterAutospacing="1" w:line="240" w:lineRule="auto"/>
+        <w:rPr>
+          <w:rFonts w:ascii="Times New Roman" w:eastAsia="Times New Roman" w:hAnsi="Times New Roman" w:cs="Times New Roman"/>
+          <w:kern w:val="0"/>
+          <w14:ligatures w14:val="none"/>
+        </w:rPr>
+      </w:pPr>
+      <w:r>
+        <w:rPr>
+          <w:rFonts w:ascii="Times New Roman" w:eastAsia="Times New Roman" w:hAnsi="Times New Roman" w:cs="Times New Roman"/>
+          <w:kern w:val="0"/>
+          <w14:ligatures w14:val="none"/>
+        </w:rPr>
+        <w:t>Remov</w:t>
+      </w:r>
+      <w:r>
+        <w:rPr>
+          <w:rFonts w:ascii="Times New Roman" w:eastAsia="Times New Roman" w:hAnsi="Times New Roman" w:cs="Times New Roman"/>
+          <w:kern w:val="0"/>
+          <w14:ligatures w14:val="none"/>
+        </w:rPr>
+        <w:t>es</w:t>
+      </w:r>
+      <w:r>
+        <w:rPr>
+          <w:rFonts w:ascii="Times New Roman" w:eastAsia="Times New Roman" w:hAnsi="Times New Roman" w:cs="Times New Roman"/>
+          <w:kern w:val="0"/>
+          <w14:ligatures w14:val="none"/>
+        </w:rPr>
+        <w:t xml:space="preserve"> duplicate URLs</w:t>
+      </w:r>
+    </w:p>
+    <w:p>
+      <w:pPr>
+        <w:numPr>
+          <w:ilvl w:val="0"/>
+          <w:numId w:val="3"/>
+        </w:numPr>
+        <w:spacing w:before="100" w:beforeAutospacing="1" w:after="100" w:afterAutospacing="1" w:line="240" w:lineRule="auto"/>
+        <w:rPr>
+          <w:rFonts w:ascii="Times New Roman" w:eastAsia="Times New Roman" w:hAnsi="Times New Roman" w:cs="Times New Roman"/>
+          <w:kern w:val="0"/>
+          <w14:ligatures w14:val="none"/>
+        </w:rPr>
+      </w:pPr>
+      <w:r>
+        <w:rPr>
+          <w:rFonts w:ascii="Times New Roman" w:eastAsia="Times New Roman" w:hAnsi="Times New Roman" w:cs="Times New Roman"/>
+          <w:kern w:val="0"/>
+          <w14:ligatures w14:val="none"/>
+        </w:rPr>
+        <w:t>Updat</w:t>
+      </w:r>
+      <w:r>
+        <w:rPr>
+          <w:rFonts w:ascii="Times New Roman" w:eastAsia="Times New Roman" w:hAnsi="Times New Roman" w:cs="Times New Roman"/>
+          <w:kern w:val="0"/>
+          <w14:ligatures w14:val="none"/>
+        </w:rPr>
+        <w:t>es</w:t>
+      </w:r>
+      <w:r>
+        <w:rPr>
+          <w:rFonts w:ascii="Times New Roman" w:eastAsia="Times New Roman" w:hAnsi="Times New Roman" w:cs="Times New Roman"/>
+          <w:kern w:val="0"/>
+          <w14:ligatures w14:val="none"/>
+        </w:rPr>
+        <w:t xml:space="preserve"> the master </w:t>
+      </w:r>
+      <w:hyperlink r:id="rId9" w:history="1">
+        <w:r>
+          <w:rPr>
+            <w:rStyle w:val="Hyperlink"/>
+            <w:rFonts w:ascii="Times New Roman" w:eastAsia="Times New Roman" w:hAnsi="Times New Roman" w:cs="Times New Roman"/>
+            <w:kern w:val="0"/>
+            <w14:ligatures w14:val="none"/>
+          </w:rPr>
+          <w:t>review_links.csv</w:t>
+        </w:r>
+      </w:hyperlink>
+      <w:r>
+        <w:rPr>
+          <w:rFonts w:ascii="Times New Roman" w:eastAsia="Times New Roman" w:hAnsi="Times New Roman" w:cs="Times New Roman"/>
+          <w:kern w:val="0"/>
+          <w14:ligatures w14:val="none"/>
+        </w:rPr>
+        <w:t xml:space="preserve"> reference dataset</w:t>
+      </w:r>
+    </w:p>
+    <w:p>
+      <w:pPr>
+        <w:spacing w:before="100" w:beforeAutospacing="1" w:after="100" w:afterAutospacing="1" w:line="240" w:lineRule="auto"/>
+        <w:rPr>
+          <w:rFonts w:ascii="Times New Roman" w:eastAsia="Times New Roman" w:hAnsi="Times New Roman" w:cs="Times New Roman"/>
+          <w:kern w:val="0"/>
+          <w14:ligatures w14:val="none"/>
+        </w:rPr>
+      </w:pPr>
+      <w:r>
+        <w:rPr>
+          <w:rFonts w:ascii="Times New Roman" w:eastAsia="Times New Roman" w:hAnsi="Times New Roman" w:cs="Times New Roman"/>
+          <w:kern w:val="0"/>
+          <w14:ligatures w14:val="none"/>
+        </w:rPr>
+        <w:t>This script is only responsible for maintaining the master list of review articles.</w:t>
+      </w:r>
+    </w:p>
+    <w:p>
+      <w:pPr>
+        <w:pStyle w:val="Heading3"/>
+        <w:rPr>
+          <w:rFonts w:ascii="Times New Roman" w:eastAsia="Times New Roman" w:hAnsi="Times New Roman" w:cs="Times New Roman"/>
+        </w:rPr>
+      </w:pPr>
+      <w:hyperlink r:id="rId10" w:history="1">
+        <w:r>
+          <w:rPr>
+            <w:rStyle w:val="Hyperlink"/>
+            <w:rFonts w:ascii="Times New Roman" w:eastAsia="Times New Roman" w:hAnsi="Times New Roman" w:cs="Times New Roman"/>
+          </w:rPr>
+          <w:t>scrape_articles.py</w:t>
+        </w:r>
+      </w:hyperlink>
+    </w:p>
+    <w:p>
+      <w:pPr>
+        <w:spacing w:before="100" w:beforeAutospacing="1" w:after="100" w:afterAutospacing="1" w:line="240" w:lineRule="auto"/>
+        <w:rPr>
+          <w:rFonts w:ascii="Times New Roman" w:hAnsi="Times New Roman" w:cs="Times New Roman"/>
+        </w:rPr>
+      </w:pPr>
+      <w:r>
+        <w:rPr>
+          <w:rFonts w:ascii="Times New Roman" w:hAnsi="Times New Roman" w:cs="Times New Roman"/>
+        </w:rPr>
+        <w:t>This script supports the data collection stage of the project. It reads</w:t>
+      </w:r>
+      <w:r>
+        <w:rPr>
+          <w:rFonts w:ascii="Times New Roman" w:hAnsi="Times New Roman" w:cs="Times New Roman"/>
+        </w:rPr>
+        <w:t xml:space="preserve"> </w:t>
+      </w:r>
+      <w:r>
+        <w:rPr>
+          <w:rFonts w:ascii="Times New Roman" w:hAnsi="Times New Roman" w:cs="Times New Roman"/>
+        </w:rPr>
+        <w:t>the discovered Pinkbike review URLs, identifies the next article that has</w:t>
+      </w:r>
+      <w:r>
+        <w:rPr>
+          <w:rFonts w:ascii="Times New Roman" w:hAnsi="Times New Roman" w:cs="Times New Roman"/>
+        </w:rPr>
+        <w:t xml:space="preserve"> </w:t>
+      </w:r>
+      <w:r>
+        <w:rPr>
+          <w:rFonts w:ascii="Times New Roman" w:hAnsi="Times New Roman" w:cs="Times New Roman"/>
+        </w:rPr>
+        <w:t>not already been saved, downloads that article's raw HTML, and stores it</w:t>
+      </w:r>
+      <w:r>
+        <w:rPr>
+          <w:rFonts w:ascii="Times New Roman" w:hAnsi="Times New Roman" w:cs="Times New Roman"/>
+        </w:rPr>
+        <w:t xml:space="preserve"> </w:t>
+      </w:r>
+      <w:r>
+        <w:rPr>
+          <w:rFonts w:ascii="Times New Roman" w:hAnsi="Times New Roman" w:cs="Times New Roman"/>
+        </w:rPr>
+        <w:t>locally for later parsing and preprocessing.</w:t>
+      </w:r>
+      <w:r>
+        <w:rPr>
+          <w:rFonts w:ascii="Times New Roman" w:hAnsi="Times New Roman" w:cs="Times New Roman"/>
+        </w:rPr>
+        <w:t xml:space="preserve"> </w:t>
+      </w:r>
+      <w:r>
+        <w:rPr>
+          <w:rFonts w:ascii="Times New Roman" w:hAnsi="Times New Roman" w:cs="Times New Roman"/>
+        </w:rPr>
+        <w:t>The scraper intentionally processes one article per run. This conservative</w:t>
+      </w:r>
+      <w:r>
+        <w:rPr>
+          <w:rFonts w:ascii="Times New Roman" w:hAnsi="Times New Roman" w:cs="Times New Roman"/>
+        </w:rPr>
+        <w:t xml:space="preserve"> </w:t>
+      </w:r>
+      <w:r>
+        <w:rPr>
+          <w:rFonts w:ascii="Times New Roman" w:hAnsi="Times New Roman" w:cs="Times New Roman"/>
+        </w:rPr>
+        <w:t>approach reduces scraping risk, makes failures easier to inspect, and helps</w:t>
+      </w:r>
+      <w:r>
+        <w:rPr>
+          <w:rFonts w:ascii="Times New Roman" w:hAnsi="Times New Roman" w:cs="Times New Roman"/>
+        </w:rPr>
+        <w:t xml:space="preserve"> </w:t>
+      </w:r>
+      <w:r>
+        <w:rPr>
+          <w:rFonts w:ascii="Times New Roman" w:hAnsi="Times New Roman" w:cs="Times New Roman"/>
+        </w:rPr>
+        <w:t>avoid repeatedly requesting many pages from Pinkbike in a short time.</w:t>
+      </w:r>
+      <w:r>
+        <w:rPr>
+          <w:rFonts w:ascii="Times New Roman" w:hAnsi="Times New Roman" w:cs="Times New Roman"/>
+        </w:rPr>
+        <w:t xml:space="preserve"> </w:t>
+      </w:r>
+    </w:p>
+    <w:p>
+      <w:pPr>
+        <w:numPr>
+          <w:ilvl w:val="0"/>
+          <w:numId w:val="4"/>
+        </w:numPr>
+        <w:spacing w:before="100" w:beforeAutospacing="1" w:after="100" w:afterAutospacing="1" w:line="240" w:lineRule="auto"/>
+        <w:rPr>
+          <w:rFonts w:ascii="Times New Roman" w:eastAsia="Times New Roman" w:hAnsi="Times New Roman" w:cs="Times New Roman"/>
+          <w:kern w:val="0"/>
+          <w14:ligatures w14:val="none"/>
+        </w:rPr>
+      </w:pPr>
+      <w:r>
+        <w:rPr>
+          <w:rFonts w:ascii="Times New Roman" w:eastAsia="Times New Roman" w:hAnsi="Times New Roman" w:cs="Times New Roman"/>
+          <w:kern w:val="0"/>
+          <w14:ligatures w14:val="none"/>
+        </w:rPr>
+        <w:t>Read</w:t>
+      </w:r>
+      <w:r>
+        <w:rPr>
+          <w:rFonts w:ascii="Times New Roman" w:eastAsia="Times New Roman" w:hAnsi="Times New Roman" w:cs="Times New Roman"/>
+          <w:kern w:val="0"/>
+          <w14:ligatures w14:val="none"/>
+        </w:rPr>
+        <w:t>s</w:t>
+      </w:r>
+      <w:r>
+        <w:rPr>
+          <w:rFonts w:ascii="Times New Roman" w:eastAsia="Times New Roman" w:hAnsi="Times New Roman" w:cs="Times New Roman"/>
+          <w:kern w:val="0"/>
+          <w14:ligatures w14:val="none"/>
+        </w:rPr>
+        <w:t xml:space="preserve"> the master review URL list</w:t>
+      </w:r>
+    </w:p>
+    <w:p>
+      <w:pPr>
+        <w:numPr>
+          <w:ilvl w:val="0"/>
+          <w:numId w:val="4"/>
+        </w:numPr>
+        <w:spacing w:before="100" w:beforeAutospacing="1" w:after="100" w:afterAutospacing="1" w:line="240" w:lineRule="auto"/>
+        <w:rPr>
+          <w:rFonts w:ascii="Times New Roman" w:eastAsia="Times New Roman" w:hAnsi="Times New Roman" w:cs="Times New Roman"/>
+          <w:kern w:val="0"/>
+          <w14:ligatures w14:val="none"/>
+        </w:rPr>
+      </w:pPr>
+      <w:r>
+        <w:rPr>
+          <w:rFonts w:ascii="Times New Roman" w:eastAsia="Times New Roman" w:hAnsi="Times New Roman" w:cs="Times New Roman"/>
+          <w:kern w:val="0"/>
+          <w14:ligatures w14:val="none"/>
+        </w:rPr>
+        <w:t>Identif</w:t>
+      </w:r>
+      <w:r>
+        <w:rPr>
+          <w:rFonts w:ascii="Times New Roman" w:eastAsia="Times New Roman" w:hAnsi="Times New Roman" w:cs="Times New Roman"/>
+          <w:kern w:val="0"/>
+          <w14:ligatures w14:val="none"/>
+        </w:rPr>
+        <w:t>ies</w:t>
+      </w:r>
+      <w:r>
+        <w:rPr>
+          <w:rFonts w:ascii="Times New Roman" w:eastAsia="Times New Roman" w:hAnsi="Times New Roman" w:cs="Times New Roman"/>
+          <w:kern w:val="0"/>
+          <w14:ligatures w14:val="none"/>
+        </w:rPr>
+        <w:t xml:space="preserve"> the next article that has not already been downloaded</w:t>
+      </w:r>
+    </w:p>
+    <w:p>
+      <w:pPr>
+        <w:numPr>
+          <w:ilvl w:val="0"/>
+          <w:numId w:val="4"/>
+        </w:numPr>
+        <w:spacing w:before="100" w:beforeAutospacing="1" w:after="100" w:afterAutospacing="1" w:line="240" w:lineRule="auto"/>
+        <w:rPr>
+          <w:rFonts w:ascii="Times New Roman" w:eastAsia="Times New Roman" w:hAnsi="Times New Roman" w:cs="Times New Roman"/>
+          <w:kern w:val="0"/>
+          <w14:ligatures w14:val="none"/>
+        </w:rPr>
+      </w:pPr>
+      <w:r>
+        <w:rPr>
+          <w:rFonts w:ascii="Times New Roman" w:eastAsia="Times New Roman" w:hAnsi="Times New Roman" w:cs="Times New Roman"/>
+          <w:kern w:val="0"/>
+          <w14:ligatures w14:val="none"/>
+        </w:rPr>
+        <w:t>Download</w:t>
+      </w:r>
+      <w:r>
+        <w:rPr>
+          <w:rFonts w:ascii="Times New Roman" w:eastAsia="Times New Roman" w:hAnsi="Times New Roman" w:cs="Times New Roman"/>
+          <w:kern w:val="0"/>
+          <w14:ligatures w14:val="none"/>
+        </w:rPr>
+        <w:t>s</w:t>
+      </w:r>
+      <w:r>
+        <w:rPr>
+          <w:rFonts w:ascii="Times New Roman" w:eastAsia="Times New Roman" w:hAnsi="Times New Roman" w:cs="Times New Roman"/>
+          <w:kern w:val="0"/>
+          <w14:ligatures w14:val="none"/>
+        </w:rPr>
+        <w:t xml:space="preserve"> one article HTML page using Playwright</w:t>
+      </w:r>
+    </w:p>
+    <w:p>
+      <w:pPr>
+        <w:numPr>
+          <w:ilvl w:val="0"/>
+          <w:numId w:val="4"/>
+        </w:numPr>
+        <w:spacing w:before="100" w:beforeAutospacing="1" w:after="100" w:afterAutospacing="1" w:line="240" w:lineRule="auto"/>
+        <w:rPr>
+          <w:rFonts w:ascii="Times New Roman" w:eastAsia="Times New Roman" w:hAnsi="Times New Roman" w:cs="Times New Roman"/>
+          <w:kern w:val="0"/>
+          <w14:ligatures w14:val="none"/>
+        </w:rPr>
+      </w:pPr>
+      <w:r>
+        <w:rPr>
+          <w:rFonts w:ascii="Times New Roman" w:eastAsia="Times New Roman" w:hAnsi="Times New Roman" w:cs="Times New Roman"/>
+          <w:kern w:val="0"/>
+          <w14:ligatures w14:val="none"/>
+        </w:rPr>
+        <w:t>Sav</w:t>
+      </w:r>
+      <w:r>
+        <w:rPr>
+          <w:rFonts w:ascii="Times New Roman" w:eastAsia="Times New Roman" w:hAnsi="Times New Roman" w:cs="Times New Roman"/>
+          <w:kern w:val="0"/>
+          <w14:ligatures w14:val="none"/>
+        </w:rPr>
+        <w:t>es</w:t>
+      </w:r>
+      <w:r>
+        <w:rPr>
+          <w:rFonts w:ascii="Times New Roman" w:eastAsia="Times New Roman" w:hAnsi="Times New Roman" w:cs="Times New Roman"/>
+          <w:kern w:val="0"/>
+          <w14:ligatures w14:val="none"/>
+        </w:rPr>
+        <w:t xml:space="preserve"> the raw HTML locally</w:t>
+      </w:r>
+      <w:r>
+        <w:rPr>
+          <w:rFonts w:ascii="Times New Roman" w:eastAsia="Times New Roman" w:hAnsi="Times New Roman" w:cs="Times New Roman"/>
+          <w:kern w:val="0"/>
+          <w14:ligatures w14:val="none"/>
+        </w:rPr>
+        <w:t xml:space="preserve"> in </w:t>
+      </w:r>
+      <w:hyperlink r:id="rId11" w:history="1">
+        <w:r>
+          <w:rPr>
+            <w:rStyle w:val="Hyperlink"/>
+            <w:rFonts w:ascii="Times New Roman" w:eastAsia="Times New Roman" w:hAnsi="Times New Roman" w:cs="Times New Roman"/>
+            <w:kern w:val="0"/>
+            <w14:ligatures w14:val="none"/>
+          </w:rPr>
+          <w:t>data/raw/</w:t>
+        </w:r>
+        <w:proofErr w:type="spellStart"/>
+        <w:r>
+          <w:rPr>
+            <w:rStyle w:val="Hyperlink"/>
+            <w:rFonts w:ascii="Times New Roman" w:eastAsia="Times New Roman" w:hAnsi="Times New Roman" w:cs="Times New Roman"/>
+            <w:kern w:val="0"/>
+            <w14:ligatures w14:val="none"/>
+          </w:rPr>
+          <w:t>article_html</w:t>
+        </w:r>
+        <w:proofErr w:type="spellEnd"/>
+      </w:hyperlink>
+      <w:r>
+        <w:rPr>
+          <w:rFonts w:ascii="Times New Roman" w:eastAsia="Times New Roman" w:hAnsi="Times New Roman" w:cs="Times New Roman"/>
+          <w:kern w:val="0"/>
+          <w14:ligatures w14:val="none"/>
+        </w:rPr>
+        <w:t xml:space="preserve"> folder</w:t>
+      </w:r>
+    </w:p>
+    <w:p>
+      <w:pPr>
+        <w:spacing w:before="100" w:beforeAutospacing="1" w:after="100" w:afterAutospacing="1" w:line="240" w:lineRule="auto"/>
+        <w:rPr>
+          <w:rFonts w:ascii="Times New Roman" w:eastAsia="Times New Roman" w:hAnsi="Times New Roman" w:cs="Times New Roman"/>
+          <w:kern w:val="0"/>
+          <w14:ligatures w14:val="none"/>
+        </w:rPr>
+      </w:pPr>
+      <w:r>
+        <w:rPr>
+          <w:rFonts w:ascii="Times New Roman" w:eastAsia="Times New Roman" w:hAnsi="Times New Roman" w:cs="Times New Roman"/>
+          <w:kern w:val="0"/>
+          <w14:ligatures w14:val="none"/>
+        </w:rPr>
+        <w:t>The scraper intentionally downloads one article per execution. This conservative approach reduces repeated requests to the website, simplifies recovery from failures, and improves the reliability of the collection process.</w:t>
+      </w:r>
+      <w:r>
+        <w:rPr>
+          <w:rFonts w:ascii="Times New Roman" w:eastAsia="Times New Roman" w:hAnsi="Times New Roman" w:cs="Times New Roman"/>
+          <w:kern w:val="0"/>
+          <w14:ligatures w14:val="none"/>
+        </w:rPr>
+        <w:t xml:space="preserve"> Initial attempts were made to scrape multiple articles at a </w:t>
+      </w:r>
+      <w:r>
+        <w:rPr>
+          <w:rFonts w:ascii="Times New Roman" w:eastAsia="Times New Roman" w:hAnsi="Times New Roman" w:cs="Times New Roman"/>
+          <w:kern w:val="0"/>
+          <w14:ligatures w14:val="none"/>
+        </w:rPr>
+        <w:t>time but</w:t>
+      </w:r>
+      <w:r>
+        <w:rPr>
+          <w:rFonts w:ascii="Times New Roman" w:eastAsia="Times New Roman" w:hAnsi="Times New Roman" w:cs="Times New Roman"/>
+          <w:kern w:val="0"/>
+          <w14:ligatures w14:val="none"/>
+        </w:rPr>
+        <w:t xml:space="preserve"> were repeatedly blocked by Cloudflare. </w:t>
+      </w:r>
+    </w:p>
+    <w:p>
+      <w:pPr>
+        <w:pStyle w:val="Heading3"/>
+        <w:rPr>
+          <w:rFonts w:ascii="Times New Roman" w:eastAsia="Times New Roman" w:hAnsi="Times New Roman" w:cs="Times New Roman"/>
+        </w:rPr>
+      </w:pPr>
+      <w:hyperlink r:id="rId12" w:history="1">
+        <w:r>
+          <w:rPr>
+            <w:rStyle w:val="Hyperlink"/>
+            <w:rFonts w:ascii="Times New Roman" w:eastAsia="Times New Roman" w:hAnsi="Times New Roman" w:cs="Times New Roman"/>
+          </w:rPr>
+          <w:t>parse_articles.py</w:t>
+        </w:r>
+      </w:hyperlink>
+    </w:p>
+    <w:p>
+      <w:pPr>
+        <w:spacing w:before="100" w:beforeAutospacing="1" w:after="100" w:afterAutospacing="1" w:line="240" w:lineRule="auto"/>
+        <w:rPr>
+          <w:rFonts w:ascii="Times New Roman" w:hAnsi="Times New Roman" w:cs="Times New Roman"/>
+        </w:rPr>
+      </w:pPr>
+      <w:r>
+        <w:rPr>
+          <w:rFonts w:ascii="Times New Roman" w:hAnsi="Times New Roman" w:cs="Times New Roman"/>
+        </w:rPr>
+        <w:t>This script supports the cleaning and preprocessing stage of the project.</w:t>
+      </w:r>
+      <w:r>
+        <w:rPr>
+          <w:rFonts w:ascii="Times New Roman" w:hAnsi="Times New Roman" w:cs="Times New Roman"/>
+        </w:rPr>
+        <w:t xml:space="preserve"> </w:t>
+      </w:r>
+      <w:r>
+        <w:rPr>
+          <w:rFonts w:ascii="Times New Roman" w:hAnsi="Times New Roman" w:cs="Times New Roman"/>
+        </w:rPr>
+        <w:t>It converts raw saved Pinkbike article HTML files into a structured CSV</w:t>
+      </w:r>
+      <w:r>
+        <w:rPr>
+          <w:rFonts w:ascii="Times New Roman" w:hAnsi="Times New Roman" w:cs="Times New Roman"/>
+        </w:rPr>
+        <w:t xml:space="preserve"> </w:t>
+      </w:r>
+      <w:r>
+        <w:rPr>
+          <w:rFonts w:ascii="Times New Roman" w:hAnsi="Times New Roman" w:cs="Times New Roman"/>
+        </w:rPr>
+        <w:t>dataset that can be used for later sentiment analysis and NLP modeling.</w:t>
+      </w:r>
+    </w:p>
+    <w:p>
+      <w:pPr>
+        <w:numPr>
+          <w:ilvl w:val="0"/>
+          <w:numId w:val="5"/>
+        </w:numPr>
+        <w:spacing w:before="100" w:beforeAutospacing="1" w:after="100" w:afterAutospacing="1" w:line="240" w:lineRule="auto"/>
+        <w:rPr>
+          <w:rFonts w:ascii="Times New Roman" w:eastAsia="Times New Roman" w:hAnsi="Times New Roman" w:cs="Times New Roman"/>
+          <w:kern w:val="0"/>
+          <w14:ligatures w14:val="none"/>
+        </w:rPr>
+      </w:pPr>
+      <w:r>
+        <w:rPr>
+          <w:rFonts w:ascii="Times New Roman" w:eastAsia="Times New Roman" w:hAnsi="Times New Roman" w:cs="Times New Roman"/>
+          <w:kern w:val="0"/>
+          <w14:ligatures w14:val="none"/>
+        </w:rPr>
+        <w:lastRenderedPageBreak/>
+        <w:t>Read</w:t>
+      </w:r>
+      <w:r>
+        <w:rPr>
+          <w:rFonts w:ascii="Times New Roman" w:eastAsia="Times New Roman" w:hAnsi="Times New Roman" w:cs="Times New Roman"/>
+          <w:kern w:val="0"/>
+          <w14:ligatures w14:val="none"/>
+        </w:rPr>
+        <w:t>s</w:t>
+      </w:r>
+      <w:r>
+        <w:rPr>
+          <w:rFonts w:ascii="Times New Roman" w:eastAsia="Times New Roman" w:hAnsi="Times New Roman" w:cs="Times New Roman"/>
+          <w:kern w:val="0"/>
+          <w14:ligatures w14:val="none"/>
+        </w:rPr>
+        <w:t xml:space="preserve"> saved HTML files</w:t>
+      </w:r>
+    </w:p>
+    <w:p>
+      <w:pPr>
+        <w:numPr>
+          <w:ilvl w:val="0"/>
+          <w:numId w:val="5"/>
+        </w:numPr>
+        <w:spacing w:before="100" w:beforeAutospacing="1" w:after="100" w:afterAutospacing="1" w:line="240" w:lineRule="auto"/>
+        <w:rPr>
+          <w:rFonts w:ascii="Times New Roman" w:eastAsia="Times New Roman" w:hAnsi="Times New Roman" w:cs="Times New Roman"/>
+          <w:kern w:val="0"/>
+          <w14:ligatures w14:val="none"/>
+        </w:rPr>
+      </w:pPr>
+      <w:r>
+        <w:rPr>
+          <w:rFonts w:ascii="Times New Roman" w:eastAsia="Times New Roman" w:hAnsi="Times New Roman" w:cs="Times New Roman"/>
+          <w:kern w:val="0"/>
+          <w14:ligatures w14:val="none"/>
+        </w:rPr>
+        <w:t>Extract</w:t>
+      </w:r>
+      <w:r>
+        <w:rPr>
+          <w:rFonts w:ascii="Times New Roman" w:eastAsia="Times New Roman" w:hAnsi="Times New Roman" w:cs="Times New Roman"/>
+          <w:kern w:val="0"/>
+          <w14:ligatures w14:val="none"/>
+        </w:rPr>
+        <w:t>s</w:t>
+      </w:r>
+      <w:r>
+        <w:rPr>
+          <w:rFonts w:ascii="Times New Roman" w:eastAsia="Times New Roman" w:hAnsi="Times New Roman" w:cs="Times New Roman"/>
+          <w:kern w:val="0"/>
+          <w14:ligatures w14:val="none"/>
+        </w:rPr>
+        <w:t xml:space="preserve"> article metadata</w:t>
+      </w:r>
+    </w:p>
+    <w:p>
+      <w:pPr>
+        <w:numPr>
+          <w:ilvl w:val="0"/>
+          <w:numId w:val="5"/>
+        </w:numPr>
+        <w:spacing w:before="100" w:beforeAutospacing="1" w:after="100" w:afterAutospacing="1" w:line="240" w:lineRule="auto"/>
+        <w:rPr>
+          <w:rFonts w:ascii="Times New Roman" w:eastAsia="Times New Roman" w:hAnsi="Times New Roman" w:cs="Times New Roman"/>
+          <w:kern w:val="0"/>
+          <w14:ligatures w14:val="none"/>
+        </w:rPr>
+      </w:pPr>
+      <w:r>
+        <w:rPr>
+          <w:rFonts w:ascii="Times New Roman" w:eastAsia="Times New Roman" w:hAnsi="Times New Roman" w:cs="Times New Roman"/>
+          <w:kern w:val="0"/>
+          <w14:ligatures w14:val="none"/>
+        </w:rPr>
+        <w:t>Clean</w:t>
+      </w:r>
+      <w:r>
+        <w:rPr>
+          <w:rFonts w:ascii="Times New Roman" w:eastAsia="Times New Roman" w:hAnsi="Times New Roman" w:cs="Times New Roman"/>
+          <w:kern w:val="0"/>
+          <w14:ligatures w14:val="none"/>
+        </w:rPr>
+        <w:t>s</w:t>
+      </w:r>
+      <w:r>
+        <w:rPr>
+          <w:rFonts w:ascii="Times New Roman" w:eastAsia="Times New Roman" w:hAnsi="Times New Roman" w:cs="Times New Roman"/>
+          <w:kern w:val="0"/>
+          <w14:ligatures w14:val="none"/>
+        </w:rPr>
+        <w:t xml:space="preserve"> article text</w:t>
+      </w:r>
+    </w:p>
+    <w:p>
+      <w:pPr>
+        <w:numPr>
+          <w:ilvl w:val="0"/>
+          <w:numId w:val="5"/>
+        </w:numPr>
+        <w:spacing w:before="100" w:beforeAutospacing="1" w:after="100" w:afterAutospacing="1" w:line="240" w:lineRule="auto"/>
+        <w:rPr>
+          <w:rFonts w:ascii="Times New Roman" w:eastAsia="Times New Roman" w:hAnsi="Times New Roman" w:cs="Times New Roman"/>
+          <w:kern w:val="0"/>
+          <w14:ligatures w14:val="none"/>
+        </w:rPr>
+      </w:pPr>
+      <w:r>
+        <w:rPr>
+          <w:rFonts w:ascii="Times New Roman" w:eastAsia="Times New Roman" w:hAnsi="Times New Roman" w:cs="Times New Roman"/>
+          <w:kern w:val="0"/>
+          <w14:ligatures w14:val="none"/>
+        </w:rPr>
+        <w:t>Extract</w:t>
+      </w:r>
+      <w:r>
+        <w:rPr>
+          <w:rFonts w:ascii="Times New Roman" w:eastAsia="Times New Roman" w:hAnsi="Times New Roman" w:cs="Times New Roman"/>
+          <w:kern w:val="0"/>
+          <w14:ligatures w14:val="none"/>
+        </w:rPr>
+        <w:t>s</w:t>
+      </w:r>
+      <w:r>
+        <w:rPr>
+          <w:rFonts w:ascii="Times New Roman" w:eastAsia="Times New Roman" w:hAnsi="Times New Roman" w:cs="Times New Roman"/>
+          <w:kern w:val="0"/>
+          <w14:ligatures w14:val="none"/>
+        </w:rPr>
+        <w:t xml:space="preserve"> retail pricing information</w:t>
+      </w:r>
+    </w:p>
+    <w:p>
+      <w:pPr>
+        <w:numPr>
+          <w:ilvl w:val="0"/>
+          <w:numId w:val="5"/>
+        </w:numPr>
+        <w:spacing w:before="100" w:beforeAutospacing="1" w:after="100" w:afterAutospacing="1" w:line="240" w:lineRule="auto"/>
+        <w:rPr>
+          <w:rFonts w:ascii="Times New Roman" w:eastAsia="Times New Roman" w:hAnsi="Times New Roman" w:cs="Times New Roman"/>
+          <w:kern w:val="0"/>
+          <w14:ligatures w14:val="none"/>
+        </w:rPr>
+      </w:pPr>
+      <w:r>
+        <w:rPr>
+          <w:rFonts w:ascii="Times New Roman" w:eastAsia="Times New Roman" w:hAnsi="Times New Roman" w:cs="Times New Roman"/>
+          <w:kern w:val="0"/>
+          <w14:ligatures w14:val="none"/>
+        </w:rPr>
+        <w:t>Identif</w:t>
+      </w:r>
+      <w:r>
+        <w:rPr>
+          <w:rFonts w:ascii="Times New Roman" w:eastAsia="Times New Roman" w:hAnsi="Times New Roman" w:cs="Times New Roman"/>
+          <w:kern w:val="0"/>
+          <w14:ligatures w14:val="none"/>
+        </w:rPr>
+        <w:t>ies</w:t>
+      </w:r>
+      <w:r>
+        <w:rPr>
+          <w:rFonts w:ascii="Times New Roman" w:eastAsia="Times New Roman" w:hAnsi="Times New Roman" w:cs="Times New Roman"/>
+          <w:kern w:val="0"/>
+          <w14:ligatures w14:val="none"/>
+        </w:rPr>
+        <w:t xml:space="preserve"> product brands and product names</w:t>
+      </w:r>
+    </w:p>
+    <w:p>
+      <w:pPr>
+        <w:numPr>
+          <w:ilvl w:val="0"/>
+          <w:numId w:val="5"/>
+        </w:numPr>
+        <w:spacing w:before="100" w:beforeAutospacing="1" w:after="100" w:afterAutospacing="1" w:line="240" w:lineRule="auto"/>
+        <w:rPr>
+          <w:rFonts w:ascii="Times New Roman" w:eastAsia="Times New Roman" w:hAnsi="Times New Roman" w:cs="Times New Roman"/>
+          <w:kern w:val="0"/>
+          <w14:ligatures w14:val="none"/>
+        </w:rPr>
+      </w:pPr>
+      <w:r>
+        <w:rPr>
+          <w:rFonts w:ascii="Times New Roman" w:eastAsia="Times New Roman" w:hAnsi="Times New Roman" w:cs="Times New Roman"/>
+          <w:kern w:val="0"/>
+          <w14:ligatures w14:val="none"/>
+        </w:rPr>
+        <w:t>Classif</w:t>
+      </w:r>
+      <w:r>
+        <w:rPr>
+          <w:rFonts w:ascii="Times New Roman" w:eastAsia="Times New Roman" w:hAnsi="Times New Roman" w:cs="Times New Roman"/>
+          <w:kern w:val="0"/>
+          <w14:ligatures w14:val="none"/>
+        </w:rPr>
+        <w:t>ies</w:t>
+      </w:r>
+      <w:r>
+        <w:rPr>
+          <w:rFonts w:ascii="Times New Roman" w:eastAsia="Times New Roman" w:hAnsi="Times New Roman" w:cs="Times New Roman"/>
+          <w:kern w:val="0"/>
+          <w14:ligatures w14:val="none"/>
+        </w:rPr>
+        <w:t xml:space="preserve"> product category, subcategory, and review type</w:t>
+      </w:r>
+    </w:p>
+    <w:p>
+      <w:pPr>
+        <w:numPr>
+          <w:ilvl w:val="0"/>
+          <w:numId w:val="5"/>
+        </w:numPr>
+        <w:spacing w:before="100" w:beforeAutospacing="1" w:after="100" w:afterAutospacing="1" w:line="240" w:lineRule="auto"/>
+        <w:rPr>
+          <w:rFonts w:ascii="Times New Roman" w:eastAsia="Times New Roman" w:hAnsi="Times New Roman" w:cs="Times New Roman"/>
+          <w:kern w:val="0"/>
+          <w14:ligatures w14:val="none"/>
+        </w:rPr>
+      </w:pPr>
+      <w:r>
+        <w:rPr>
+          <w:rFonts w:ascii="Times New Roman" w:eastAsia="Times New Roman" w:hAnsi="Times New Roman" w:cs="Times New Roman"/>
+          <w:kern w:val="0"/>
+          <w14:ligatures w14:val="none"/>
+        </w:rPr>
+        <w:t>Produc</w:t>
+      </w:r>
+      <w:r>
+        <w:rPr>
+          <w:rFonts w:ascii="Times New Roman" w:eastAsia="Times New Roman" w:hAnsi="Times New Roman" w:cs="Times New Roman"/>
+          <w:kern w:val="0"/>
+          <w14:ligatures w14:val="none"/>
+        </w:rPr>
+        <w:t>es</w:t>
+      </w:r>
+      <w:r>
+        <w:rPr>
+          <w:rFonts w:ascii="Times New Roman" w:eastAsia="Times New Roman" w:hAnsi="Times New Roman" w:cs="Times New Roman"/>
+          <w:kern w:val="0"/>
+          <w14:ligatures w14:val="none"/>
+        </w:rPr>
+        <w:t xml:space="preserve"> the final structured review-level dataset</w:t>
+      </w:r>
+    </w:p>
+    <w:p>
+      <w:pPr>
+        <w:spacing w:before="100" w:beforeAutospacing="1" w:after="100" w:afterAutospacing="1" w:line="240" w:lineRule="auto"/>
+        <w:rPr>
+          <w:rFonts w:ascii="Times New Roman" w:eastAsia="Times New Roman" w:hAnsi="Times New Roman" w:cs="Times New Roman"/>
+          <w:kern w:val="0"/>
+          <w14:ligatures w14:val="none"/>
+        </w:rPr>
+      </w:pPr>
+      <w:r>
+        <w:rPr>
+          <w:rFonts w:ascii="Times New Roman" w:eastAsia="Times New Roman" w:hAnsi="Times New Roman" w:cs="Times New Roman"/>
+          <w:kern w:val="0"/>
+          <w14:ligatures w14:val="none"/>
+        </w:rPr>
+        <w:t>The resulting dataset will be used during the modeling phase of the project.</w:t>
+      </w:r>
+    </w:p>
+    <w:p>
+      <w:pPr>
+        <w:pStyle w:val="Heading2"/>
+        <w:rPr>
+          <w:rFonts w:ascii="Times New Roman" w:eastAsia="Times New Roman" w:hAnsi="Times New Roman" w:cs="Times New Roman"/>
+        </w:rPr>
+      </w:pPr>
+      <w:r>
+        <w:rPr>
+          <w:rFonts w:ascii="Times New Roman" w:eastAsia="Times New Roman" w:hAnsi="Times New Roman" w:cs="Times New Roman"/>
+        </w:rPr>
+        <w:t>Project Data Structure</w:t>
+      </w:r>
+    </w:p>
+    <w:p>
+      <w:pPr>
+        <w:spacing w:before="100" w:beforeAutospacing="1" w:after="100" w:afterAutospacing="1" w:line="240" w:lineRule="auto"/>
+        <w:rPr>
+          <w:rFonts w:ascii="Times New Roman" w:eastAsia="Times New Roman" w:hAnsi="Times New Roman" w:cs="Times New Roman"/>
+          <w:kern w:val="0"/>
+          <w14:ligatures w14:val="none"/>
+        </w:rPr>
+      </w:pPr>
+      <w:r>
+        <w:rPr>
+          <w:rFonts w:ascii="Times New Roman" w:eastAsia="Times New Roman" w:hAnsi="Times New Roman" w:cs="Times New Roman"/>
+          <w:kern w:val="0"/>
+          <w14:ligatures w14:val="none"/>
+        </w:rPr>
+        <w:t>The project organizes data into three primary stages.</w:t>
+      </w:r>
+    </w:p>
+    <w:p>
+      <w:pPr>
+        <w:pStyle w:val="Heading3"/>
+        <w:rPr>
+          <w:rFonts w:ascii="Times New Roman" w:eastAsia="Times New Roman" w:hAnsi="Times New Roman" w:cs="Times New Roman"/>
+          <w:sz w:val="36"/>
+          <w:szCs w:val="36"/>
+        </w:rPr>
+      </w:pPr>
+      <w:hyperlink r:id="rId13" w:history="1">
+        <w:r>
+          <w:rPr>
+            <w:rStyle w:val="Hyperlink"/>
+            <w:rFonts w:ascii="Times New Roman" w:eastAsia="Times New Roman" w:hAnsi="Times New Roman" w:cs="Times New Roman"/>
+            <w:kern w:val="0"/>
+            <w14:ligatures w14:val="none"/>
+          </w:rPr>
+          <w:t>data/reference</w:t>
+        </w:r>
+      </w:hyperlink>
+    </w:p>
+    <w:p>
+      <w:pPr>
+        <w:spacing w:before="100" w:beforeAutospacing="1" w:after="100" w:afterAutospacing="1" w:line="240" w:lineRule="auto"/>
+        <w:rPr>
+          <w:rFonts w:ascii="Times New Roman" w:eastAsia="Times New Roman" w:hAnsi="Times New Roman" w:cs="Times New Roman"/>
+          <w:kern w:val="0"/>
+          <w14:ligatures w14:val="none"/>
+        </w:rPr>
+      </w:pPr>
+      <w:r>
+        <w:rPr>
+          <w:rFonts w:ascii="Times New Roman" w:eastAsia="Times New Roman" w:hAnsi="Times New Roman" w:cs="Times New Roman"/>
+          <w:kern w:val="0"/>
+          <w14:ligatures w14:val="none"/>
+        </w:rPr>
+        <w:t>Reference datasets used during processing</w:t>
+      </w:r>
+    </w:p>
+    <w:p>
+      <w:pPr>
+        <w:numPr>
+          <w:ilvl w:val="0"/>
+          <w:numId w:val="6"/>
+        </w:numPr>
+        <w:spacing w:before="100" w:beforeAutospacing="1" w:after="100" w:afterAutospacing="1" w:line="240" w:lineRule="auto"/>
+        <w:rPr>
+          <w:rFonts w:ascii="Times New Roman" w:eastAsia="Times New Roman" w:hAnsi="Times New Roman" w:cs="Times New Roman"/>
+          <w:kern w:val="0"/>
+          <w14:ligatures w14:val="none"/>
+        </w:rPr>
+      </w:pPr>
+      <w:r>
+        <w:rPr>
+          <w:rFonts w:ascii="Times New Roman" w:eastAsia="Times New Roman" w:hAnsi="Times New Roman" w:cs="Times New Roman"/>
+          <w:kern w:val="0"/>
+          <w14:ligatures w14:val="none"/>
+        </w:rPr>
+        <w:t>Master review URL list</w:t>
+      </w:r>
+    </w:p>
+    <w:p>
+      <w:pPr>
+        <w:numPr>
+          <w:ilvl w:val="0"/>
+          <w:numId w:val="6"/>
+        </w:numPr>
+        <w:spacing w:before="100" w:beforeAutospacing="1" w:after="100" w:afterAutospacing="1" w:line="240" w:lineRule="auto"/>
+        <w:rPr>
+          <w:rFonts w:ascii="Times New Roman" w:eastAsia="Times New Roman" w:hAnsi="Times New Roman" w:cs="Times New Roman"/>
+          <w:kern w:val="0"/>
+          <w14:ligatures w14:val="none"/>
+        </w:rPr>
+      </w:pPr>
+      <w:r>
+        <w:rPr>
+          <w:rFonts w:ascii="Times New Roman" w:eastAsia="Times New Roman" w:hAnsi="Times New Roman" w:cs="Times New Roman"/>
+          <w:kern w:val="0"/>
+          <w14:ligatures w14:val="none"/>
+        </w:rPr>
+        <w:t>Controlled brand reference table</w:t>
+      </w:r>
+    </w:p>
+    <w:p>
+      <w:pPr>
+        <w:pStyle w:val="Heading3"/>
+        <w:rPr>
+          <w:rFonts w:ascii="Times New Roman" w:eastAsia="Times New Roman" w:hAnsi="Times New Roman" w:cs="Times New Roman"/>
+        </w:rPr>
+      </w:pPr>
+      <w:hyperlink r:id="rId14" w:history="1">
+        <w:r>
+          <w:rPr>
+            <w:rStyle w:val="Hyperlink"/>
+            <w:rFonts w:ascii="Times New Roman" w:eastAsia="Times New Roman" w:hAnsi="Times New Roman" w:cs="Times New Roman"/>
+            <w:kern w:val="0"/>
+            <w14:ligatures w14:val="none"/>
+          </w:rPr>
+          <w:t>data/raw</w:t>
+        </w:r>
+        <w:r>
+          <w:rPr>
+            <w:rStyle w:val="Hyperlink"/>
+            <w:rFonts w:ascii="Times New Roman" w:eastAsia="Times New Roman" w:hAnsi="Times New Roman" w:cs="Times New Roman"/>
+            <w:kern w:val="0"/>
+            <w14:ligatures w14:val="none"/>
+          </w:rPr>
+          <w:t>/</w:t>
+        </w:r>
+        <w:proofErr w:type="spellStart"/>
+        <w:r>
+          <w:rPr>
+            <w:rStyle w:val="Hyperlink"/>
+            <w:rFonts w:ascii="Times New Roman" w:eastAsia="Times New Roman" w:hAnsi="Times New Roman" w:cs="Times New Roman"/>
+            <w:kern w:val="0"/>
+            <w14:ligatures w14:val="none"/>
+          </w:rPr>
+          <w:t>article_html</w:t>
+        </w:r>
+        <w:proofErr w:type="spellEnd"/>
+      </w:hyperlink>
+    </w:p>
+    <w:p>
+      <w:pPr>
+        <w:spacing w:before="100" w:beforeAutospacing="1" w:after="100" w:afterAutospacing="1" w:line="240" w:lineRule="auto"/>
+        <w:rPr>
+          <w:rFonts w:ascii="Times New Roman" w:eastAsia="Times New Roman" w:hAnsi="Times New Roman" w:cs="Times New Roman"/>
+          <w:kern w:val="0"/>
+          <w14:ligatures w14:val="none"/>
+        </w:rPr>
+      </w:pPr>
+      <w:r>
+        <w:rPr>
+          <w:rFonts w:ascii="Times New Roman" w:eastAsia="Times New Roman" w:hAnsi="Times New Roman" w:cs="Times New Roman"/>
+          <w:kern w:val="0"/>
+          <w14:ligatures w14:val="none"/>
+        </w:rPr>
+        <w:t>Raw HTML files downloaded from Pinkbike. These files preserve the original webpage content before any preprocessing is performed.</w:t>
+      </w:r>
+    </w:p>
+    <w:p>
+      <w:pPr>
+        <w:pStyle w:val="Heading3"/>
+        <w:rPr>
+          <w:rFonts w:ascii="Times New Roman" w:eastAsia="Times New Roman" w:hAnsi="Times New Roman" w:cs="Times New Roman"/>
+        </w:rPr>
+      </w:pPr>
+      <w:hyperlink r:id="rId15" w:history="1">
+        <w:r>
+          <w:rPr>
+            <w:rStyle w:val="Hyperlink"/>
+            <w:rFonts w:ascii="Times New Roman" w:eastAsia="Times New Roman" w:hAnsi="Times New Roman" w:cs="Times New Roman"/>
+            <w:kern w:val="0"/>
+            <w14:ligatures w14:val="none"/>
+          </w:rPr>
+          <w:t>data/processed</w:t>
+        </w:r>
+      </w:hyperlink>
+    </w:p>
+    <w:p>
+      <w:pPr>
+        <w:spacing w:before="100" w:beforeAutospacing="1" w:after="100" w:afterAutospacing="1" w:line="240" w:lineRule="auto"/>
+        <w:rPr>
+          <w:rFonts w:ascii="Times New Roman" w:eastAsia="Times New Roman" w:hAnsi="Times New Roman" w:cs="Times New Roman"/>
+          <w:kern w:val="0"/>
+          <w14:ligatures w14:val="none"/>
+        </w:rPr>
+      </w:pPr>
+      <w:r>
+        <w:rPr>
+          <w:rFonts w:ascii="Times New Roman" w:eastAsia="Times New Roman" w:hAnsi="Times New Roman" w:cs="Times New Roman"/>
+          <w:kern w:val="0"/>
+          <w14:ligatures w14:val="none"/>
+        </w:rPr>
+        <w:t>The final structured review dataset produced by the parsing pipeline. This dataset contains cleaned article text, metadata, extracted product information, and classification fields that will support future NLP modeling.</w:t>
+      </w:r>
+      <w:r>
+        <w:rPr>
+          <w:rFonts w:ascii="Times New Roman" w:eastAsia="Times New Roman" w:hAnsi="Times New Roman" w:cs="Times New Roman"/>
+          <w:kern w:val="0"/>
+          <w14:ligatures w14:val="none"/>
+        </w:rPr>
+        <w:t xml:space="preserve"> Currently the dataset is called </w:t>
+      </w:r>
+      <w:hyperlink r:id="rId16" w:history="1">
+        <w:r>
+          <w:rPr>
+            <w:rStyle w:val="Hyperlink"/>
+            <w:rFonts w:ascii="Times New Roman" w:eastAsia="Times New Roman" w:hAnsi="Times New Roman" w:cs="Times New Roman"/>
+            <w:kern w:val="0"/>
+            <w14:ligatures w14:val="none"/>
+          </w:rPr>
+          <w:t>pinkbike_reviews.csv</w:t>
+        </w:r>
+      </w:hyperlink>
+      <w:r>
+        <w:rPr>
+          <w:rFonts w:ascii="Times New Roman" w:eastAsia="Times New Roman" w:hAnsi="Times New Roman" w:cs="Times New Roman"/>
+          <w:kern w:val="0"/>
+          <w14:ligatures w14:val="none"/>
+        </w:rPr>
+        <w:t>.</w:t>
+      </w:r>
+    </w:p>
+    <w:p>
+      <w:pPr>
+        <w:pStyle w:val="Heading2"/>
+        <w:rPr>
+          <w:rFonts w:ascii="Times New Roman" w:eastAsia="Times New Roman" w:hAnsi="Times New Roman" w:cs="Times New Roman"/>
+        </w:rPr>
+      </w:pPr>
+      <w:r>
+        <w:rPr>
+          <w:rFonts w:ascii="Times New Roman" w:eastAsia="Times New Roman" w:hAnsi="Times New Roman" w:cs="Times New Roman"/>
+        </w:rPr>
+        <w:t>Overall Workflow</w:t>
+      </w:r>
+    </w:p>
+    <w:p>
+      <w:pPr>
+        <w:numPr>
+          <w:ilvl w:val="0"/>
+          <w:numId w:val="7"/>
+        </w:numPr>
+        <w:spacing w:before="100" w:beforeAutospacing="1" w:after="100" w:afterAutospacing="1" w:line="240" w:lineRule="auto"/>
+        <w:rPr>
+          <w:rFonts w:ascii="Times New Roman" w:eastAsia="Times New Roman" w:hAnsi="Times New Roman" w:cs="Times New Roman"/>
+          <w:kern w:val="0"/>
+          <w14:ligatures w14:val="none"/>
+        </w:rPr>
+      </w:pPr>
+      <w:r>
+        <w:rPr>
+          <w:rFonts w:ascii="Times New Roman" w:eastAsia="Times New Roman" w:hAnsi="Times New Roman" w:cs="Times New Roman"/>
+          <w:kern w:val="0"/>
+          <w14:ligatures w14:val="none"/>
+        </w:rPr>
+        <w:t>Discover review article URLs.</w:t>
+      </w:r>
+    </w:p>
+    <w:p>
+      <w:pPr>
+        <w:numPr>
+          <w:ilvl w:val="0"/>
+          <w:numId w:val="7"/>
+        </w:numPr>
+        <w:spacing w:before="100" w:beforeAutospacing="1" w:after="100" w:afterAutospacing="1" w:line="240" w:lineRule="auto"/>
+        <w:rPr>
+          <w:rFonts w:ascii="Times New Roman" w:eastAsia="Times New Roman" w:hAnsi="Times New Roman" w:cs="Times New Roman"/>
+          <w:kern w:val="0"/>
+          <w14:ligatures w14:val="none"/>
+        </w:rPr>
+      </w:pPr>
+      <w:r>
+        <w:rPr>
+          <w:rFonts w:ascii="Times New Roman" w:eastAsia="Times New Roman" w:hAnsi="Times New Roman" w:cs="Times New Roman"/>
+          <w:kern w:val="0"/>
+          <w14:ligatures w14:val="none"/>
+        </w:rPr>
+        <w:t>Build and maintain the master URL reference file.</w:t>
+      </w:r>
+    </w:p>
+    <w:p>
+      <w:pPr>
+        <w:numPr>
+          <w:ilvl w:val="0"/>
+          <w:numId w:val="7"/>
+        </w:numPr>
+        <w:spacing w:before="100" w:beforeAutospacing="1" w:after="100" w:afterAutospacing="1" w:line="240" w:lineRule="auto"/>
+        <w:rPr>
+          <w:rFonts w:ascii="Times New Roman" w:eastAsia="Times New Roman" w:hAnsi="Times New Roman" w:cs="Times New Roman"/>
+          <w:kern w:val="0"/>
+          <w14:ligatures w14:val="none"/>
+        </w:rPr>
+      </w:pPr>
+      <w:r>
+        <w:rPr>
+          <w:rFonts w:ascii="Times New Roman" w:eastAsia="Times New Roman" w:hAnsi="Times New Roman" w:cs="Times New Roman"/>
+          <w:kern w:val="0"/>
+          <w14:ligatures w14:val="none"/>
+        </w:rPr>
+        <w:t>Download raw HTML for new review articles.</w:t>
+      </w:r>
+    </w:p>
+    <w:p>
+      <w:pPr>
+        <w:numPr>
+          <w:ilvl w:val="0"/>
+          <w:numId w:val="7"/>
+        </w:numPr>
+        <w:spacing w:before="100" w:beforeAutospacing="1" w:after="100" w:afterAutospacing="1" w:line="240" w:lineRule="auto"/>
+        <w:rPr>
+          <w:rFonts w:ascii="Times New Roman" w:eastAsia="Times New Roman" w:hAnsi="Times New Roman" w:cs="Times New Roman"/>
+          <w:kern w:val="0"/>
+          <w14:ligatures w14:val="none"/>
+        </w:rPr>
+      </w:pPr>
+      <w:r>
+        <w:rPr>
+          <w:rFonts w:ascii="Times New Roman" w:eastAsia="Times New Roman" w:hAnsi="Times New Roman" w:cs="Times New Roman"/>
+          <w:kern w:val="0"/>
+          <w14:ligatures w14:val="none"/>
+        </w:rPr>
+        <w:t>Parse HTML into structured review records.</w:t>
+      </w:r>
+    </w:p>
+    <w:p>
+      <w:pPr>
+        <w:numPr>
+          <w:ilvl w:val="0"/>
+          <w:numId w:val="7"/>
+        </w:numPr>
+        <w:spacing w:before="100" w:beforeAutospacing="1" w:after="100" w:afterAutospacing="1" w:line="240" w:lineRule="auto"/>
+        <w:rPr>
+          <w:rFonts w:ascii="Times New Roman" w:eastAsia="Times New Roman" w:hAnsi="Times New Roman" w:cs="Times New Roman"/>
+          <w:kern w:val="0"/>
+          <w14:ligatures w14:val="none"/>
+        </w:rPr>
+      </w:pPr>
+      <w:r>
+        <w:rPr>
+          <w:rFonts w:ascii="Times New Roman" w:eastAsia="Times New Roman" w:hAnsi="Times New Roman" w:cs="Times New Roman"/>
+          <w:kern w:val="0"/>
+          <w14:ligatures w14:val="none"/>
+        </w:rPr>
+        <w:t>Clean article text and extract product information.</w:t>
+      </w:r>
+    </w:p>
+    <w:p>
+      <w:pPr>
+        <w:numPr>
+          <w:ilvl w:val="0"/>
+          <w:numId w:val="7"/>
+        </w:numPr>
+        <w:spacing w:before="100" w:beforeAutospacing="1" w:after="100" w:afterAutospacing="1" w:line="240" w:lineRule="auto"/>
+        <w:rPr>
+          <w:rFonts w:ascii="Times New Roman" w:eastAsia="Times New Roman" w:hAnsi="Times New Roman" w:cs="Times New Roman"/>
+          <w:kern w:val="0"/>
+          <w14:ligatures w14:val="none"/>
+        </w:rPr>
+      </w:pPr>
+      <w:r>
+        <w:rPr>
+          <w:rFonts w:ascii="Times New Roman" w:eastAsia="Times New Roman" w:hAnsi="Times New Roman" w:cs="Times New Roman"/>
+          <w:kern w:val="0"/>
+          <w14:ligatures w14:val="none"/>
+        </w:rPr>
+        <w:t>Produce a structured dataset for sentiment analysis and machine learning.</w:t>
+      </w:r>
+    </w:p>
+    <w:p>
+      <w:pPr>
+        <w:spacing w:before="100" w:beforeAutospacing="1" w:after="100" w:afterAutospacing="1" w:line="240" w:lineRule="auto"/>
+        <w:rPr>
+          <w:rFonts w:ascii="Times New Roman" w:eastAsia="Times New Roman" w:hAnsi="Times New Roman" w:cs="Times New Roman"/>
+          <w:kern w:val="0"/>
+          <w14:ligatures w14:val="none"/>
+        </w:rPr>
+      </w:pPr>
+      <w:r>
+        <w:rPr>
+          <w:rFonts w:ascii="Times New Roman" w:eastAsia="Times New Roman" w:hAnsi="Times New Roman" w:cs="Times New Roman"/>
+          <w:kern w:val="0"/>
+          <w14:ligatures w14:val="none"/>
+        </w:rPr>
+        <w:t>This modular workflow separates data collection from preprocessing, making the pipeline easier to maintain, validate, and extend.</w:t>
+      </w:r>
+    </w:p>
+    <w:p>
+      <w:pPr>
+        <w:pStyle w:val="Heading2"/>
+        <w:rPr>
+          <w:rFonts w:ascii="Times New Roman" w:eastAsia="Times New Roman" w:hAnsi="Times New Roman" w:cs="Times New Roman"/>
+        </w:rPr>
+      </w:pPr>
+      <w:r>
+        <w:rPr>
+          <w:rFonts w:ascii="Times New Roman" w:eastAsia="Times New Roman" w:hAnsi="Times New Roman" w:cs="Times New Roman"/>
+        </w:rPr>
+        <w:lastRenderedPageBreak/>
+        <w:t>AI Use Documentation</w:t>
+      </w:r>
+    </w:p>
+    <w:p>
+      <w:pPr>
+        <w:spacing w:before="100" w:beforeAutospacing="1" w:after="100" w:afterAutospacing="1" w:line="240" w:lineRule="auto"/>
+        <w:rPr>
+          <w:rFonts w:ascii="Times New Roman" w:eastAsia="Times New Roman" w:hAnsi="Times New Roman" w:cs="Times New Roman"/>
+          <w:kern w:val="0"/>
+          <w14:ligatures w14:val="none"/>
+        </w:rPr>
+      </w:pPr>
+      <w:r>
+        <w:rPr>
+          <w:rFonts w:ascii="Times New Roman" w:eastAsia="Times New Roman" w:hAnsi="Times New Roman" w:cs="Times New Roman"/>
+          <w:kern w:val="0"/>
+          <w14:ligatures w14:val="none"/>
+        </w:rPr>
+        <w:t>AI tools were used throughout development to assist with the following</w:t>
+      </w:r>
+    </w:p>
+    <w:p>
+      <w:pPr>
+        <w:numPr>
+          <w:ilvl w:val="0"/>
+          <w:numId w:val="8"/>
+        </w:numPr>
+        <w:spacing w:before="100" w:beforeAutospacing="1" w:after="100" w:afterAutospacing="1" w:line="240" w:lineRule="auto"/>
+        <w:rPr>
+          <w:rFonts w:ascii="Times New Roman" w:eastAsia="Times New Roman" w:hAnsi="Times New Roman" w:cs="Times New Roman"/>
+          <w:kern w:val="0"/>
+          <w14:ligatures w14:val="none"/>
+        </w:rPr>
+      </w:pPr>
+      <w:r>
+        <w:rPr>
+          <w:rFonts w:ascii="Times New Roman" w:eastAsia="Times New Roman" w:hAnsi="Times New Roman" w:cs="Times New Roman"/>
+          <w:kern w:val="0"/>
+          <w14:ligatures w14:val="none"/>
+        </w:rPr>
+        <w:t>Debugging and troubleshooting</w:t>
+      </w:r>
+      <w:r>
+        <w:rPr>
+          <w:rFonts w:ascii="Times New Roman" w:eastAsia="Times New Roman" w:hAnsi="Times New Roman" w:cs="Times New Roman"/>
+          <w:kern w:val="0"/>
+          <w14:ligatures w14:val="none"/>
+        </w:rPr>
+        <w:t xml:space="preserve"> specifically around </w:t>
+      </w:r>
+    </w:p>
+    <w:p>
+      <w:pPr>
+        <w:numPr>
+          <w:ilvl w:val="0"/>
+          <w:numId w:val="8"/>
+        </w:numPr>
+        <w:spacing w:before="100" w:beforeAutospacing="1" w:after="100" w:afterAutospacing="1" w:line="240" w:lineRule="auto"/>
+        <w:rPr>
+          <w:rFonts w:ascii="Times New Roman" w:eastAsia="Times New Roman" w:hAnsi="Times New Roman" w:cs="Times New Roman"/>
+          <w:kern w:val="0"/>
+          <w14:ligatures w14:val="none"/>
+        </w:rPr>
+      </w:pPr>
+      <w:r>
+        <w:rPr>
+          <w:rFonts w:ascii="Times New Roman" w:eastAsia="Times New Roman" w:hAnsi="Times New Roman" w:cs="Times New Roman"/>
+          <w:kern w:val="0"/>
+          <w14:ligatures w14:val="none"/>
+        </w:rPr>
+        <w:t>Writing and improving comments and documentation</w:t>
+      </w:r>
     </w:p>
     <w:sectPr>
       <w:pgSz w:w="12240" w:h="15840"/>
@@ -3666,6 +4084,18 @@
       <w:shd w:val="clear" w:color="auto" w:fill="E1DFDD"/>
     </w:rPr>
   </w:style>
+  <w:style w:type="character" w:styleId="FollowedHyperlink">
+    <w:name w:val="FollowedHyperlink"/>
+    <w:basedOn w:val="DefaultParagraphFont"/>
+    <w:uiPriority w:val="99"/>
+    <w:semiHidden/>
+    <w:unhideWhenUsed/>
+    <w:rsid w:val="00B92850"/>
+    <w:rPr>
+      <w:color w:val="96607D" w:themeColor="followedHyperlink"/>
+      <w:u w:val="single"/>
+    </w:rPr>
+  </w:style>
 </w:styles>
 </file>
 

</xml_diff>